<commit_message>
build: regenerate final PDF + Word set after data-reconciliation fixes
Final clean build of all deliverables:
- PDF (xelatex, CTU format): LUAN_AN 157pp, CD1 36pp, CD2 34pp — 0 fatal,
  0 missing glyphs, 0 overflow ≥50pt
- Word (.docx, CTU template + openxml covers): LUAN_AN, CHUYEN_DE_1, CHUYEN_DE_2

Co-Authored-By: Claude Opus 4.8 (1M context) <noreply@anthropic.com>
Claude-Session: https://claude.ai/code/session_01Xumaoraa2DLWLXsgJJ62oq
</commit_message>
<xml_diff>
--- a/dist/word/CHUYEN_DE_1_vi.docx
+++ b/dist/word/CHUYEN_DE_1_vi.docx
@@ -17392,13 +17392,13 @@
       </w:r>
     </w:p>
     <w:bookmarkEnd w:id="85"/>
-    <w:bookmarkStart w:id="86" w:name="X6a85d48ebba89ed501c82db6baeb7531f044f18"/>
+    <w:bookmarkStart w:id="86" w:name="X6c40c201817921434380e55aec36ff2dee88100"/>
     <w:p>
       <w:pPr>
         <w:pStyle w:val="Heading4"/>
       </w:pPr>
       <w:r>
-        <w:t xml:space="preserve">2.3.7.4 Trung Quốc (mẫu phân tích của nghiên cứu Trung Quốc n=4.559; mẫu gộp mô tả gồm đợt 2024, n=2.189)</w:t>
+        <w:t xml:space="preserve">2.3.7.4 Trung Quốc (mẫu phân tích của nghiên cứu Trung Quốc n=4.544; mẫu gộp mô tả gồm đợt 2024, n=2.189)</w:t>
       </w:r>
     </w:p>
     <w:p>

</xml_diff>

<commit_message>
refs(cd): APA7 review of chuyên đề reference lists
CĐ2: add a/b/c year-suffixes to the three same-year Đỗ & Phan (2026)
manuscripts (2026a Revisiting/P3, 2026b China/P5, 2026c Unveiling/P2),
updating every in-text and Appendix-B cite; harmonise Mar co-author
initial to T. T.; drop a stray DOI working-note; fix Mathews book italics.
CĐ1: reorder Peng (single-author before two-author); re-letter the three
World Bank 2025 entries alphabetically by title (flipping two in-text
cites); letter the two ADB 2026 entries; harmonise Mar initial.
Recompiled PDFs (CD1 36pp, CD2 34pp; 0 missing glyphs) + Word.

Co-Authored-By: Claude Opus 4.8 (1M context) <noreply@anthropic.com>
Claude-Session: https://claude.ai/code/session_01Xumaoraa2DLWLXsgJJ62oq
</commit_message>
<xml_diff>
--- a/dist/word/CHUYEN_DE_1_vi.docx
+++ b/dist/word/CHUYEN_DE_1_vi.docx
@@ -3884,7 +3884,7 @@
         <w:t xml:space="preserve">Lớp thứ sáu là xung đột Trung Đông 2026</w:t>
       </w:r>
       <w:r>
-        <w:t xml:space="preserve">, IMF (2026, tháng 4) điều chỉnh giảm tăng trưởng toàn cầu xuống 3,1% năm 2026; ADB (2026, tháng 4) dự báo Pacific 3,4%, Đông Nam Á 4,7%, Việt Nam 7,0%. Riêng Việt Nam, ADB (2026, tháng 4) ghi nhận GDP lịch sử 2025 đạt 8,0% và cập nhật dự báo 7,2% (2026) rồi 7,0% (2027).</w:t>
+        <w:t xml:space="preserve">, IMF (2026, tháng 4) điều chỉnh giảm tăng trưởng toàn cầu xuống 3,1% năm 2026; ADB (2026a) dự báo Pacific 3,4%, Đông Nam Á 4,7%, Việt Nam 7,0%. Riêng Việt Nam, ADB (2026a) ghi nhận GDP lịch sử 2025 đạt 8,0% và cập nhật dự báo 7,2% (2026) rồi 7,0% (2027).</w:t>
       </w:r>
       <w:r>
         <w:t xml:space="preserve"> </w:t>
@@ -7122,7 +7122,7 @@
         <w:t xml:space="preserve">Nhóm I, Advanced đổi mới sáng tạo dẫn dắt</w:t>
       </w:r>
       <w:r>
-        <w:t xml:space="preserve">: WGI Rule of Law &gt;+0,80; GNI bình quân đầu người &gt;30.000 USD (phương pháp Atlas, theo ngưỡng phân loại thu nhập FY2026 của World Bank, 2025a); GDP tăng trưởng dựa trên đổi mới công nghệ, dịch vụ tài chính và hàm lượng tri thức cao. Bằng chứng WBES: R&amp;D &gt;10%, ISO &gt;20%, độ lệch chuẩn log năng suất trong đợt thấp nhất sáu nhóm (~1,00, phân tán hẹp, ít phân bổ sai).</w:t>
+        <w:t xml:space="preserve">: WGI Rule of Law &gt;+0,80; GNI bình quân đầu người &gt;30.000 USD (phương pháp Atlas, theo ngưỡng phân loại thu nhập FY2026 của World Bank, 2025b); GDP tăng trưởng dựa trên đổi mới công nghệ, dịch vụ tài chính và hàm lượng tri thức cao. Bằng chứng WBES: R&amp;D &gt;10%, ISO &gt;20%, độ lệch chuẩn log năng suất trong đợt thấp nhất sáu nhóm (~1,00, phân tán hẹp, ít phân bổ sai).</w:t>
       </w:r>
     </w:p>
     <w:p>
@@ -17388,7 +17388,7 @@
         <w:t xml:space="preserve"> </w:t>
       </w:r>
       <w:r>
-        <w:t xml:space="preserve">tháng 9/2025 nhấn mạnh nhân lực công nghệ cao là nút thắt để Việt Nam dịch chuyển từ lắp ráp sang thiết kế và R&amp;D (World Bank, 2025b), nhất quán với hàm ý sequencing năng lực (TCI trước FSTS) của chuyên đề; snapshot kinh tế Data360 xác nhận vị thế thu nhập trung bình thấp với GNI bình quân 4.180 USD năm 2023, đúng ngưỡng Nhóm IV của khung ICRV (World Bank, 2026).</w:t>
+        <w:t xml:space="preserve">tháng 9/2025 nhấn mạnh nhân lực công nghệ cao là nút thắt để Việt Nam dịch chuyển từ lắp ráp sang thiết kế và R&amp;D (World Bank, 2025a), nhất quán với hàm ý sequencing năng lực (TCI trước FSTS) của chuyên đề; snapshot kinh tế Data360 xác nhận vị thế thu nhập trung bình thấp với GNI bình quân 4.180 USD năm 2023, đúng ngưỡng Nhóm IV của khung ICRV (World Bank, 2026).</w:t>
       </w:r>
     </w:p>
     <w:bookmarkEnd w:id="85"/>
@@ -17525,7 +17525,7 @@
         <w:t xml:space="preserve">Bước ngoặt 2026</w:t>
       </w:r>
       <w:r>
-        <w:t xml:space="preserve">: 11 khoáng sản thiết yếu (Cu, Li, Mo, Mn, Co, Ni, W, REE). Xuất khẩu đồng 1,69 triệu tấn (2024) = 22,1% tổng xuất khẩu. Oyu Tolgoi mục tiêu 500.000 tấn/năm 2028–2036. Trung Quốc chi phối chế biến: 100% graphite, 90% Mn, 70% Co (ADB, 2026, tháng 5).</w:t>
+        <w:t xml:space="preserve">: 11 khoáng sản thiết yếu (Cu, Li, Mo, Mn, Co, Ni, W, REE). Xuất khẩu đồng 1,69 triệu tấn (2024) = 22,1% tổng xuất khẩu. Oyu Tolgoi mục tiêu 500.000 tấn/năm 2028–2036. Trung Quốc chi phối chế biến: 100% graphite, 90% Mn, 70% Co (ADB, 2026a).</w:t>
       </w:r>
     </w:p>
     <w:p>
@@ -21271,7 +21271,7 @@
         <w:pStyle w:val="BodyText"/>
       </w:pPr>
       <w:r>
-        <w:t xml:space="preserve">ADB. (2026, tháng 4).</w:t>
+        <w:t xml:space="preserve">ADB. (2026a, tháng 4).</w:t>
       </w:r>
       <w:r>
         <w:t xml:space="preserve"> </w:t>
@@ -21292,7 +21292,7 @@
         <w:pStyle w:val="BodyText"/>
       </w:pPr>
       <w:r>
-        <w:t xml:space="preserve">ADB. (2026).</w:t>
+        <w:t xml:space="preserve">ADB. (2026b).</w:t>
       </w:r>
       <w:r>
         <w:t xml:space="preserve"> </w:t>
@@ -22015,7 +22015,7 @@
         <w:pStyle w:val="BodyText"/>
       </w:pPr>
       <w:r>
-        <w:t xml:space="preserve">Mar, J., Đỗ, T. H., &amp; Phan, A. T. (2026). Digital adoption and internationalization in Singapore.</w:t>
+        <w:t xml:space="preserve">Mar, T. T., Đỗ, T. H., &amp; Phan, A. T. (2026). Digital adoption and internationalization in Singapore.</w:t>
       </w:r>
       <w:r>
         <w:t xml:space="preserve"> </w:t>
@@ -22123,7 +22123,7 @@
         <w:pStyle w:val="BodyText"/>
       </w:pPr>
       <w:r>
-        <w:t xml:space="preserve">Peng, M. W., &amp; Ilinitch, A. Y. (1998). Export intermediary firms: A note on export development research.</w:t>
+        <w:t xml:space="preserve">Peng, M. W. (2003). Institutional transitions and strategic choices.</w:t>
       </w:r>
       <w:r>
         <w:t xml:space="preserve"> </w:t>
@@ -22133,10 +22133,10 @@
           <w:iCs/>
           <w:i/>
         </w:rPr>
-        <w:t xml:space="preserve">Journal of International Business Studies, 29</w:t>
-      </w:r>
-      <w:r>
-        <w:t xml:space="preserve">(3), 609–620. https://doi.org/10.1057/palgrave.jibs.8490011</w:t>
+        <w:t xml:space="preserve">Academy of Management Review, 28</w:t>
+      </w:r>
+      <w:r>
+        <w:t xml:space="preserve">(2), 275–296.</w:t>
       </w:r>
     </w:p>
     <w:p>
@@ -22144,7 +22144,7 @@
         <w:pStyle w:val="BodyText"/>
       </w:pPr>
       <w:r>
-        <w:t xml:space="preserve">Peng, M. W. (2003). Institutional transitions and strategic choices.</w:t>
+        <w:t xml:space="preserve">Peng, M. W., &amp; Ilinitch, A. Y. (1998). Export intermediary firms: A note on export development research.</w:t>
       </w:r>
       <w:r>
         <w:t xml:space="preserve"> </w:t>
@@ -22154,10 +22154,10 @@
           <w:iCs/>
           <w:i/>
         </w:rPr>
-        <w:t xml:space="preserve">Academy of Management Review, 28</w:t>
-      </w:r>
-      <w:r>
-        <w:t xml:space="preserve">(2), 275–296.</w:t>
+        <w:t xml:space="preserve">Journal of International Business Studies, 29</w:t>
+      </w:r>
+      <w:r>
+        <w:t xml:space="preserve">(3), 609–620. https://doi.org/10.1057/palgrave.jibs.8490011</w:t>
       </w:r>
     </w:p>
     <w:p>
@@ -22522,7 +22522,7 @@
         <w:pStyle w:val="BodyText"/>
       </w:pPr>
       <w:r>
-        <w:t xml:space="preserve">World Bank. (2025).</w:t>
+        <w:t xml:space="preserve">World Bank. (2025a).</w:t>
       </w:r>
       <w:r>
         <w:t xml:space="preserve"> </w:t>
@@ -22532,7 +22532,7 @@
           <w:iCs/>
           <w:i/>
         </w:rPr>
-        <w:t xml:space="preserve">World Bank Enterprise Surveys 2025</w:t>
+        <w:t xml:space="preserve">Taking stock, September 2025: Viet Nam economic update, Nurturing Viet Nam’s high-tech talents</w:t>
       </w:r>
       <w:r>
         <w:t xml:space="preserve">. World Bank Group.</w:t>
@@ -22543,7 +22543,7 @@
         <w:pStyle w:val="BodyText"/>
       </w:pPr>
       <w:r>
-        <w:t xml:space="preserve">World Bank. (2025a).</w:t>
+        <w:t xml:space="preserve">World Bank. (2025b).</w:t>
       </w:r>
       <w:r>
         <w:t xml:space="preserve"> </w:t>
@@ -22564,7 +22564,7 @@
         <w:pStyle w:val="BodyText"/>
       </w:pPr>
       <w:r>
-        <w:t xml:space="preserve">World Bank. (2025b).</w:t>
+        <w:t xml:space="preserve">World Bank. (2025c).</w:t>
       </w:r>
       <w:r>
         <w:t xml:space="preserve"> </w:t>
@@ -22574,7 +22574,7 @@
           <w:iCs/>
           <w:i/>
         </w:rPr>
-        <w:t xml:space="preserve">Taking stock, September 2025: Viet Nam economic update, Nurturing Viet Nam’s high-tech talents</w:t>
+        <w:t xml:space="preserve">World Bank Enterprise Surveys 2025</w:t>
       </w:r>
       <w:r>
         <w:t xml:space="preserve">. World Bank Group.</w:t>

</xml_diff>

<commit_message>
refs(cd1): resolve misattributed ADB Mongolia-minerals citation
The '(ADB, 2026, tháng 5)' cite on the Mongolia critical-minerals figures
did not match any catalogued ADB report (the listed ADO is the April
edition) and the source could not be verified, so the false attribution
is removed and replaced with a visible 'source-to-be-added' marker rather
than fabricating a reference. Reassigned the Vietnam-specific GDP sentence
to ADB (2026b) Vietnam economic outlook, which was otherwise an uncited
(orphan) reference; the regional forecast keeps ADB (2026a) ADO April 2026.
Both ADB 2026 entries are now cited exactly once. Recompiled PDF + Word.

Co-Authored-By: Claude Opus 4.8 (1M context) <noreply@anthropic.com>
Claude-Session: https://claude.ai/code/session_01Xumaoraa2DLWLXsgJJ62oq
</commit_message>
<xml_diff>
--- a/dist/word/CHUYEN_DE_1_vi.docx
+++ b/dist/word/CHUYEN_DE_1_vi.docx
@@ -3884,7 +3884,7 @@
         <w:t xml:space="preserve">Lớp thứ sáu là xung đột Trung Đông 2026</w:t>
       </w:r>
       <w:r>
-        <w:t xml:space="preserve">, IMF (2026, tháng 4) điều chỉnh giảm tăng trưởng toàn cầu xuống 3,1% năm 2026; ADB (2026a) dự báo Pacific 3,4%, Đông Nam Á 4,7%, Việt Nam 7,0%. Riêng Việt Nam, ADB (2026a) ghi nhận GDP lịch sử 2025 đạt 8,0% và cập nhật dự báo 7,2% (2026) rồi 7,0% (2027).</w:t>
+        <w:t xml:space="preserve">, IMF (2026, tháng 4) điều chỉnh giảm tăng trưởng toàn cầu xuống 3,1% năm 2026; ADB (2026a) dự báo Pacific 3,4%, Đông Nam Á 4,7%, Việt Nam 7,0%. Riêng Việt Nam, ADB (2026b) ghi nhận GDP lịch sử 2025 đạt 8,0% và cập nhật dự báo 7,2% (2026) rồi 7,0% (2027).</w:t>
       </w:r>
       <w:r>
         <w:t xml:space="preserve"> </w:t>
@@ -17525,7 +17525,7 @@
         <w:t xml:space="preserve">Bước ngoặt 2026</w:t>
       </w:r>
       <w:r>
-        <w:t xml:space="preserve">: 11 khoáng sản thiết yếu (Cu, Li, Mo, Mn, Co, Ni, W, REE). Xuất khẩu đồng 1,69 triệu tấn (2024) = 22,1% tổng xuất khẩu. Oyu Tolgoi mục tiêu 500.000 tấn/năm 2028–2036. Trung Quốc chi phối chế biến: 100% graphite, 90% Mn, 70% Co (ADB, 2026a).</w:t>
+        <w:t xml:space="preserve">: 11 khoáng sản thiết yếu (Cu, Li, Mo, Mn, Co, Ni, W, REE). Xuất khẩu đồng 1,69 triệu tấn (2024) = 22,1% tổng xuất khẩu. Oyu Tolgoi mục tiêu 500.000 tấn/năm 2028–2036. Trung Quốc chi phối chế biến: 100% graphite, 90% Mn, 70% Co (số liệu thị trường khoáng sản 2024, nguồn cần bổ sung khi hoàn thiện).</w:t>
       </w:r>
     </w:p>
     <w:p>

</xml_diff>

<commit_message>
refs(cd1): remove unsourced Mongolia critical-minerals figures
Per author decision: the 2026 critical-minerals data (copper exports,
Oyu Tolgoi targets, China processing shares) had no verifiable source in
the uploaded materials, so the passage is removed rather than left with a
placeholder. Mongolia resource-curse framing (Sachs & Warner) retained.

Co-Authored-By: Claude Opus 4.8 (1M context) <noreply@anthropic.com>
Claude-Session: https://claude.ai/code/session_01Xumaoraa2DLWLXsgJJ62oq
</commit_message>
<xml_diff>
--- a/dist/word/CHUYEN_DE_1_vi.docx
+++ b/dist/word/CHUYEN_DE_1_vi.docx
@@ -17513,19 +17513,6 @@
       </w:r>
       <w:r>
         <w:t xml:space="preserve">(Sachs &amp; Warner, 2001).</w:t>
-      </w:r>
-      <w:r>
-        <w:t xml:space="preserve"> </w:t>
-      </w:r>
-      <w:r>
-        <w:rPr>
-          <w:bCs/>
-          <w:b/>
-        </w:rPr>
-        <w:t xml:space="preserve">Bước ngoặt 2026</w:t>
-      </w:r>
-      <w:r>
-        <w:t xml:space="preserve">: 11 khoáng sản thiết yếu (Cu, Li, Mo, Mn, Co, Ni, W, REE). Xuất khẩu đồng 1,69 triệu tấn (2024) = 22,1% tổng xuất khẩu. Oyu Tolgoi mục tiêu 500.000 tấn/năm 2028–2036. Trung Quốc chi phối chế biến: 100% graphite, 90% Mn, 70% Co (số liệu thị trường khoáng sản 2024, nguồn cần bổ sung khi hoàn thiện).</w:t>
       </w:r>
     </w:p>
     <w:p>

</xml_diff>

<commit_message>
docs: consistency sweep — soften residual "inverts", flag CD vintage tables
Follow-up global consistency pass after the Timor exclusion and dissolution
reframe:
- Soften the remaining "the relationship inverts" to "turns mildly convex" in
  the P8 manuscript and blinded copy (dissolution-consistent; convexity is
  suggestive, not a confirmed inversion).
- Update p8/P8_REDESIGN_2026-06.md empirical core to the 7-economy values
  (N=1,450; Timor excluded), with the 8-economy build noted as superseded.
- Broaden the CD1 data note to cover all descriptive tables (2.3.3-2.3.8),
  explicitly flagging that Group VI rows (e.g. Table 2.3.3.1 n=1,916/16 waves)
  are the Timor-inclusive vintage pending a 7-economy descriptive re-lock; the
  econometric estimates (P7/P8) already exclude Timor.
- Rebuilt manuscript/blinded docx and CD1 PDF/docx.

Co-Authored-By: Claude Opus 4.8 (1M context) <noreply@anthropic.com>
Claude-Session: https://claude.ai/code/session_01Xumaoraa2DLWLXsgJJ62oq
</commit_message>
<xml_diff>
--- a/dist/word/CHUYEN_DE_1_vi.docx
+++ b/dist/word/CHUYEN_DE_1_vi.docx
@@ -476,7 +476,60 @@
           <w:iCs/>
           <w:i/>
         </w:rPr>
-        <w:t xml:space="preserve">của luận án và Chuyên đề 2: 87.987 doanh nghiệp / 49 nền (gồm Nhật Bản; mẫu gộp phân loại 96.415 / 52 nền), được hợp nhất và hài hòa hóa theo quy trình tại Phụ lục A của luận án, mọi kết quả kinh tế lượng được dẫn chiếu theo khung này; hồi quy toàn mẫu P7 chạy với M2 N=80.373 và M5 N=78.445. Sau khi đã chạy vòng tái ước lượng 49 nền gồm Nhật Bản, mô tả và ước lượng nay dùng chung MỘT khung 49 nền. Trường hợp biên SIDS: Nhóm VI gồm 7 nền Pacific (Timor-Leste bị loại theo phân loại Ngân hàng Thế giới và Liên Hợp Quốc — không phải quốc đảo Thái Bình Dương). Lưu ý: các tỷ lệ mô tả Nhóm VI ở Mục 2.3.4–2.3.6 tính trên tập mô tả mở rộng và đang chờ re-lock theo 7 nền.</w:t>
+        <w:t xml:space="preserve">của luận án và Chuyên đề 2: 87.987 doanh nghiệp / 49 nền (gồm Nhật Bản; mẫu gộp phân loại 96.415 / 52 nền), được hợp nhất và hài hòa hóa theo quy trình tại Phụ lục A của luận án, mọi kết quả kinh tế lượng được dẫn chiếu theo khung này; hồi quy toàn mẫu P7 chạy với M2 N=80.373 và M5 N=78.445. Sau khi đã chạy vòng tái ước lượng 49 nền gồm Nhật Bản, mô tả và ước lượng nay dùng chung MỘT khung 49 nền. Trường hợp biên SIDS: Nhóm VI gồm 7 nền Pacific (Timor-Leste bị loại theo phân loại Ngân hàng Thế giới và Liên Hợp Quốc — không phải quốc đảo Thái Bình Dương). Lưu ý: mọi thống kê mô tả Nhóm VI ở các Mục 2.3.3–2.3.8 (gồm số quan sát, độ phân tán, tỷ lệ đổi mới/số/cấu trúc — ví dụ Bảng 2.3.3.1 ghi n=1.916, 16 đợt) được tính trên</w:t>
+      </w:r>
+      <w:r>
+        <w:rPr>
+          <w:iCs/>
+          <w:i/>
+        </w:rPr>
+        <w:t xml:space="preserve"> </w:t>
+      </w:r>
+      <w:r>
+        <w:rPr>
+          <w:bCs/>
+          <w:b/>
+          <w:iCs/>
+          <w:i/>
+        </w:rPr>
+        <w:t xml:space="preserve">tập mô tả mở rộng gồm Timor-Leste</w:t>
+      </w:r>
+      <w:r>
+        <w:rPr>
+          <w:iCs/>
+          <w:i/>
+        </w:rPr>
+        <w:t xml:space="preserve"> </w:t>
+      </w:r>
+      <w:r>
+        <w:rPr>
+          <w:iCs/>
+          <w:i/>
+        </w:rPr>
+        <w:t xml:space="preserve">và đang</w:t>
+      </w:r>
+      <w:r>
+        <w:rPr>
+          <w:iCs/>
+          <w:i/>
+        </w:rPr>
+        <w:t xml:space="preserve"> </w:t>
+      </w:r>
+      <w:r>
+        <w:rPr>
+          <w:bCs/>
+          <w:b/>
+          <w:iCs/>
+          <w:i/>
+        </w:rPr>
+        <w:t xml:space="preserve">chờ re-lock theo 7 nền Pacific</w:t>
+      </w:r>
+      <w:r>
+        <w:rPr>
+          <w:iCs/>
+          <w:i/>
+        </w:rPr>
+        <w:t xml:space="preserve">; phần ước lượng kinh tế lượng (P7/P8) đã loại Timor và dùng 7 nền (mẫu chính P8 N=1.450).</w:t>
       </w:r>
     </w:p>
     <w:p>

</xml_diff>

<commit_message>
build(docx): dựng lại bản Word từ MD mới (Bậc, thuật ngữ, slop, LP nội tệ)
- dist/word/{LUAN_AN_vi,CHUYEN_DE_1_vi,CHUYEN_DE_2_vi}.docx và
  dist/luan_an_ctu/LUAN_AN_FULL_vi.docx tái sinh qua build_word_all.sh +
  build_dissertation_docx.sh, khớp 7 file MD đã sửa.
- Verify: 0 "Tier-", có "Bậc"/"nội tệ" trong document.xml.

Co-Authored-By: Claude Opus 4.8 (1M context) <noreply@anthropic.com>
Claude-Session: https://claude.ai/code/session_01Xumaoraa2DLWLXsgJJ62oq
</commit_message>
<xml_diff>
--- a/dist/word/CHUYEN_DE_1_vi.docx
+++ b/dist/word/CHUYEN_DE_1_vi.docx
@@ -446,7 +446,7 @@
           <w:iCs/>
           <w:i/>
         </w:rPr>
-        <w:t xml:space="preserve">phục vụ toàn bộ thống kê Mục 2.3.3–2.3.8: 88.869 doanh nghiệp, 103 cặp nền kinh tế × năm (2006–2026), tính trực tiếp từ tệp vi mô WBES, mỗi cặp nền kinh tế × năm lấy đúng một cross-section chuẩn (loại các điều tra phi chính thức, siêu nhỏ và panel mở rộng), chỉ nhận các đợt khảo sát từ 2006 trở đi khi WBES áp dụng bộ câu hỏi so sánh được toàn cầu. Mẫu gộp này chứa đầy đủ các biến mô tả (R&amp;D, ISO, đổi mới, tham nhũng, giới) vốn không thuộc tập biến ước lượng. (ii)</w:t>
+        <w:t xml:space="preserve">phục vụ toàn bộ thống kê Mục 2.3.3–2.3.8: 88.869 doanh nghiệp, 103 cặp nền kinh tế × năm (2006–2026), tính trực tiếp từ tệp vi mô WBES, mỗi cặp nền kinh tế × năm lấy đúng một lát cắt ngang chuẩn (loại các điều tra phi chính thức, siêu nhỏ và panel mở rộng), chỉ nhận các đợt khảo sát từ 2006 trở đi khi WBES áp dụng bộ câu hỏi so sánh được toàn cầu. Mẫu gộp này chứa đầy đủ các biến mô tả (R&amp;D, ISO, đổi mới, tham nhũng, giới) vốn không thuộc tập biến ước lượng. (ii)</w:t>
       </w:r>
       <w:r>
         <w:rPr>
@@ -543,7 +543,7 @@
         <w:t xml:space="preserve"> </w:t>
       </w:r>
       <w:r>
-        <w:t xml:space="preserve">(innovation-driven so với resource-driven) và xác nhận khuôn mẫu</w:t>
+        <w:t xml:space="preserve">(đổi mới dẫn dắt so với tài nguyên dẫn dắt; innovation- vs. resource-driven) và xác nhận khuôn mẫu</w:t>
       </w:r>
       <w:r>
         <w:t xml:space="preserve"> </w:t>
@@ -1119,7 +1119,21 @@
               <w:jc w:val="left"/>
             </w:pPr>
             <w:r>
-              <w:t xml:space="preserve">Thay đổi theo thời gian: Δ điểm phần trăm 2018–2026 so với 2006–2012</w:t>
+              <w:t xml:space="preserve">Thay đổi theo thời gian:</w:t>
+            </w:r>
+            <w:r>
+              <w:t xml:space="preserve"> </w:t>
+            </w:r>
+            <m:oMath>
+              <m:r>
+                <m:t>Δ</m:t>
+              </m:r>
+            </m:oMath>
+            <w:r>
+              <w:t xml:space="preserve"> </w:t>
+            </w:r>
+            <w:r>
+              <w:t xml:space="preserve">điểm phần trăm 2018–2026 so với 2006–2012</w:t>
             </w:r>
           </w:p>
         </w:tc>
@@ -1646,7 +1660,18 @@
               <w:jc w:val="left"/>
             </w:pPr>
             <w:r>
-              <w:t xml:space="preserve">Slope chart 2006–2012 vs 2018–2026 (Δ điểm phần trăm theo nhóm ICRV)</w:t>
+              <w:t xml:space="preserve">Slope chart 2006–2012 vs 2018–2026 (</w:t>
+            </w:r>
+            <m:oMath>
+              <m:r>
+                <m:t>Δ</m:t>
+              </m:r>
+            </m:oMath>
+            <w:r>
+              <w:t xml:space="preserve"> </w:t>
+            </w:r>
+            <w:r>
+              <w:t xml:space="preserve">điểm phần trăm theo nhóm ICRV)</w:t>
             </w:r>
           </w:p>
         </w:tc>
@@ -2313,7 +2338,7 @@
               <w:jc w:val="left"/>
             </w:pPr>
             <w:r>
-              <w:t xml:space="preserve">DAI (Tier-1)</w:t>
+              <w:t xml:space="preserve">DAI (Bậc 1)</w:t>
             </w:r>
           </w:p>
         </w:tc>
@@ -2351,7 +2376,7 @@
               <w:jc w:val="left"/>
             </w:pPr>
             <w:r>
-              <w:t xml:space="preserve">DAI (Tier-2)</w:t>
+              <w:t xml:space="preserve">DAI (Bậc 2)</w:t>
             </w:r>
           </w:p>
         </w:tc>
@@ -3864,7 +3889,7 @@
         <w:pStyle w:val="BodyText"/>
       </w:pPr>
       <w:r>
-        <w:t xml:space="preserve">Bức tranh hiệu quả hoạt động kinh doanh của doanh nghiệp châu Á 2006–2026 được định hình bởi</w:t>
+        <w:t xml:space="preserve">Diện mạo hiệu quả hoạt động kinh doanh của doanh nghiệp châu Á 2006–2026 được định hình bởi</w:t>
       </w:r>
       <w:r>
         <w:t xml:space="preserve"> </w:t>
@@ -4498,7 +4523,7 @@
         <w:t xml:space="preserve">(1) Cross-sectional không cho phép suy luận nhân quả mạnh</w:t>
       </w:r>
       <w:r>
-        <w:t xml:space="preserve">: WBES là repeated lát cắt ngang, không phải panel cân bằng. Kết luận nhân quả dựa trên ước lượng biến công cụ từ nghiên cứu Việt Nam và không thể khái quát trực tiếp sang 50 nền kinh tế (gồm Nhật Bản) trong khung phân tích.</w:t>
+        <w:t xml:space="preserve">: WBES là repeated lát cắt ngang, không phải dữ liệu bảng cân bằng. Kết luận nhân quả dựa trên ước lượng biến công cụ từ nghiên cứu Việt Nam và không thể khái quát trực tiếp sang 50 nền kinh tế (gồm Nhật Bản) trong khung phân tích.</w:t>
       </w:r>
     </w:p>
     <w:p>
@@ -4510,10 +4535,10 @@
           <w:bCs/>
           <w:b/>
         </w:rPr>
-        <w:t xml:space="preserve">(2) Chỉ số áp dụng số bị giới hạn ở Tier-1 và Tier-2</w:t>
-      </w:r>
-      <w:r>
-        <w:t xml:space="preserve">: Bộ câu hỏi PICS3/Standardized chỉ có website nhị phân (Tier-1). BREADY có Tầng 2 nhưng không đo Tầng 3/4. Chuyên đề chỉ phát biểu về phần bù Tầng 1/2, không phải toàn bộ phổ áp dụng số.</w:t>
+        <w:t xml:space="preserve">(2) Chỉ số áp dụng số bị giới hạn ở Bậc 1 và Bậc 2</w:t>
+      </w:r>
+      <w:r>
+        <w:t xml:space="preserve">: Bộ câu hỏi PICS3/Standardized chỉ có website nhị phân (Bậc 1). BREADY có Bậc 2 nhưng không đo Bậc 3/4. Chuyên đề chỉ phát biểu về phần bù Bậc 1/2, không phải toàn bộ phổ áp dụng số.</w:t>
       </w:r>
     </w:p>
     <w:p>
@@ -4603,7 +4628,7 @@
         <w:t xml:space="preserve">(7) Không có dữ liệu cường độ số theo ngành</w:t>
       </w:r>
       <w:r>
-        <w:t xml:space="preserve">: WBES không phân biệt chỉ số áp dụng số theo ngành. Doanh nghiệp sản xuất và dịch vụ có hệ số DAI Tầng 1 giống nhau nhưng cường độ số thực tế khác nhau. Hiệu ứng cố định ngành kiểm soát được một phần nhưng không giải quyết triệt để vấn đề này.</w:t>
+        <w:t xml:space="preserve">: WBES không phân biệt chỉ số áp dụng số theo ngành. Doanh nghiệp sản xuất và dịch vụ có hệ số DAI Bậc 1 giống nhau nhưng cường độ số thực tế khác nhau. Hiệu ứng cố định ngành kiểm soát được một phần nhưng không giải quyết triệt để vấn đề này.</w:t>
       </w:r>
     </w:p>
     <w:bookmarkEnd w:id="29"/>
@@ -4643,7 +4668,7 @@
           <w:bCs/>
           <w:b/>
         </w:rPr>
-        <w:t xml:space="preserve">Bức tranh thực trạng đa chiều</w:t>
+        <w:t xml:space="preserve">Toàn cảnh thực trạng đa chiều</w:t>
       </w:r>
       <w:r>
         <w:t xml:space="preserve"> </w:t>
@@ -4670,7 +4695,7 @@
         <w:t xml:space="preserve"> </w:t>
       </w:r>
       <w:r>
-        <w:t xml:space="preserve">(innovation-driven so với resource-driven), phát hiện lý thuyết mới chưa có trong tài liệu hiện hành. Hai nhóm cùng mức thu nhập cao nhưng cấu trúc năng lực đối lập: R&amp;D 21,0% so với 7,0%; doanh nghiệp xuất khẩu 24,5% so với 11,7%; nữ quản lý cấp cao 20,7% so với 4,6%, phản ánh hai cơ chế tăng trưởng hoàn toàn khác nhau.</w:t>
+        <w:t xml:space="preserve">(đổi mới dẫn dắt so với tài nguyên dẫn dắt), phát hiện lý thuyết mới chưa có trong tài liệu hiện hành. Hai nhóm cùng mức thu nhập cao nhưng cấu trúc năng lực đối lập: R&amp;D 21,0% so với 7,0%; doanh nghiệp xuất khẩu 24,5% so với 11,7%; nữ quản lý cấp cao 20,7% so với 4,6%, phản ánh hai cơ chế tăng trưởng hoàn toàn khác nhau.</w:t>
       </w:r>
     </w:p>
     <w:p>
@@ -4691,7 +4716,7 @@
         <w:t xml:space="preserve"> </w:t>
       </w:r>
       <w:r>
-        <w:t xml:space="preserve">ở các nhóm đang nổi và chuyển đổi 2018–2026, mở rộng khuôn mẫu từ 17 nền lên 50 nền. Phân tách Tầng 1 (website nhị phân, tiệm cận bão hòa ở Advanced) và Tầng 2 (tổng hợp đa thành phần, đang phát triển ở các nhóm IV–VI).</w:t>
+        <w:t xml:space="preserve">ở các nhóm đang nổi và chuyển đổi 2018–2026, mở rộng khuôn mẫu từ 17 nền lên 50 nền. Phân tách Bậc 1 (website nhị phân, tiệm cận bão hòa ở Advanced) và Bậc 2 (tổng hợp đa thành phần, đang phát triển ở các nhóm IV–VI).</w:t>
       </w:r>
     </w:p>
     <w:p>
@@ -4925,7 +4950,7 @@
         <w:t xml:space="preserve"> </w:t>
       </w:r>
       <w:r>
-        <w:t xml:space="preserve">giữa các nền kinh tế dùng chỉ số không thứ nguyên (ROS, tỷ suất sinh lời trên doanh thu); (c) trong khung ước lượng của luận án, LP được chuẩn hóa điểm z trong từng cặp nền kinh tế × năm và mô hình luôn có hiệu ứng cố định quốc gia (Phụ lục A của luận án). Giá trị LP được winsorize ở mức 1/99 phân vị trong cụm quốc gia × năm để kiểm soát ngoại lai. Lựa chọn năng suất lao động làm thước đo hiệu quả phù hợp với dữ liệu WBES vốn không có giá thị trường và dữ liệu lợi nhuận thưa (Combs et al., 2005; Cusolito &amp; Maloney, 2018; Richard et al., 2009).</w:t>
+        <w:t xml:space="preserve">giữa các nền kinh tế dùng chỉ số không thứ nguyên (ROS, tỷ suất sinh lời trên doanh thu); (c) trong khung ước lượng của luận án, LP được chuẩn hóa điểm z trong từng cặp nền kinh tế × năm và mô hình luôn có hiệu ứng cố định quốc gia (Phụ lục A của luận án). Giá trị LP được cắt đuôi (winsorize) ở mức 1/99 phân vị trong cụm quốc gia × năm để kiểm soát ngoại lai. Lựa chọn năng suất lao động làm thước đo hiệu quả phù hợp với dữ liệu WBES vốn không có giá thị trường và dữ liệu lợi nhuận thưa (Combs et al., 2005; Cusolito &amp; Maloney, 2018; Richard et al., 2009).</w:t>
       </w:r>
     </w:p>
     <w:p>
@@ -5136,7 +5161,7 @@
           <w:bCs/>
           <w:b/>
         </w:rPr>
-        <w:t xml:space="preserve">Tier-1 Sự hiện diện số cơ bản</w:t>
+        <w:t xml:space="preserve">Bậc 1 Sự hiện diện số cơ bản</w:t>
       </w:r>
       <w:r>
         <w:t xml:space="preserve">. Spec 2 (BREADY 2018+ trở lên): tổng hợp chuẩn hóa z website + cường độ thanh toán điện tử (k33/k38),</w:t>
@@ -5149,7 +5174,7 @@
           <w:bCs/>
           <w:b/>
         </w:rPr>
-        <w:t xml:space="preserve">Tier-2 Chuyển đổi số cơ bản</w:t>
+        <w:t xml:space="preserve">Bậc 2 Chuyển đổi số cơ bản</w:t>
       </w:r>
       <w:r>
         <w:t xml:space="preserve">. Phân tầng đo lường số hóa theo Verhoef et al. (2021); vai trò công cụ số trong quốc tế hóa theo Banalieva &amp; Dhanaraj (2019).</w:t>
@@ -5167,7 +5192,7 @@
         <w:t xml:space="preserve">Hài hòa hóa xuyên ba thế hệ schema</w:t>
       </w:r>
       <w:r>
-        <w:t xml:space="preserve">: World Bank Enterprise Surveys trải qua ba thế hệ lược đồ trong giai đoạn nghiên cứu. Thế hệ 1, PICS3/MENA-WBES (2006–2012, 18 đợt, n=8.048): bảng hỏi PICS3 cho khu vực Đông Nam Á và Trung Á. Thế hệ 2, Standardized (2013–2017, 27 đợt, n=23.940): áp dụng đồng nhất xuyên toàn cầu từ 2013. Thế hệ 3, BREADY/BEE/EAP Core (2018–2026, 58 đợt, n=56.881): tích hợp thanh toán điện tử, điện toán đám mây, ngân hàng di động vào các module bổ sung, gây</w:t>
+        <w:t xml:space="preserve">: World Bank Enterprise Surveys trải qua ba thế hệ lược đồ trong giai đoạn nghiên cứu. Thế hệ 1, PICS3/MENA-WBES (2006–2012, 18 đợt, n=8.048): bảng hỏi PICS3 cho khu vực Đông Nam Á và Trung Á. Thế hệ 2, Standardized (2013–2017, 27 đợt, n=23.940): áp dụng đồng nhất xuyên toàn cầu từ 2013. Thế hệ 3, BREADY/BEE/EAP Core (2018–2026, 58 đợt, n=56.881): tích hợp thanh toán điện tử, điện toán đám mây, ngân hàng di động vào các phân hệ bổ sung, gây</w:t>
       </w:r>
       <w:r>
         <w:t xml:space="preserve"> </w:t>
@@ -5231,7 +5256,7 @@
         <w:t xml:space="preserve"> </w:t>
       </w:r>
       <w:r>
-        <w:t xml:space="preserve">hấp thụ hiệu ứng lược đồ tĩnh; (3b) mô hình neo (anchor model), chạy hồi quy với dữ liệu đến 2024, khóa hệ số, kiểm định ổn định với dữ liệu đầy đủ bằng Chow test; (3c) panel hậu đại dịch độc lập, tách 2025 thành tập xác thực ngoài mẫu cho kỷ nguyên hậu COVID và AI.</w:t>
+        <w:t xml:space="preserve">hấp thụ hiệu ứng lược đồ tĩnh; (3b) mô hình neo (anchor model), chạy hồi quy với dữ liệu đến 2024, khóa hệ số, kiểm định ổn định với dữ liệu đầy đủ bằng Chow test; (3c) dữ liệu bảng hậu đại dịch độc lập, tách 2025 thành tập xác thực ngoài mẫu cho kỷ nguyên hậu COVID và AI.</w:t>
       </w:r>
     </w:p>
     <w:p>
@@ -5661,7 +5686,7 @@
         <w:pStyle w:val="BodyText"/>
       </w:pPr>
       <w:r>
-        <w:t xml:space="preserve">Giá trị LP được winsorize ở mức 1/99 phân vị trong cụm quốc gia × năm để kiểm soát ngoại lai; vì doanh thu báo cáo bằng nội tệ, tính so sánh xuyên quốc gia được bảo đảm bằng chuẩn hóa trong từng cặp nền kinh tế × năm và chỉ số không thứ nguyên, như trình bày ở mục 2.2 (World Bank Enterprise Surveys, 2025).</w:t>
+        <w:t xml:space="preserve">Giá trị LP được cắt đuôi (winsorize) ở mức 1/99 phân vị trong cụm quốc gia × năm để kiểm soát ngoại lai; vì doanh thu báo cáo bằng nội tệ, tính so sánh xuyên quốc gia được bảo đảm bằng chuẩn hóa trong từng cặp nền kinh tế × năm và chỉ số không thứ nguyên, như trình bày ở mục 2.2 (World Bank Enterprise Surveys, 2025).</w:t>
       </w:r>
     </w:p>
     <w:bookmarkEnd w:id="36"/>
@@ -5710,7 +5735,7 @@
         <w:t xml:space="preserve">Chiều 1, Năng suất lao động</w:t>
       </w:r>
       <w:r>
-        <w:t xml:space="preserve">. Biến đo lường chính: LP = ln(doanh thu hàng năm PPP / số lao động toàn thời gian). Đây là</w:t>
+        <w:t xml:space="preserve">. Biến đo lường chính: LP = ln(doanh thu hàng năm trong nội tệ / số lao động toàn thời gian), chuẩn hóa z trong từng cặp nền kinh tế × năm để bảo đảm so sánh được (xem Mục 2.3.1.1). Đây là</w:t>
       </w:r>
       <w:r>
         <w:t xml:space="preserve"> </w:t>
@@ -5771,7 +5796,7 @@
         <w:t xml:space="preserve">Chiều 4, Đổi mới sáng tạo và cấu trúc doanh nghiệp</w:t>
       </w:r>
       <w:r>
-        <w:t xml:space="preserve">. Biến đo lường: (a) R&amp;D (tỷ lệ doanh nghiệp có chi tiêu R&amp;D dương); (b) đổi mới sản phẩm mới; (c) đổi mới quy trình mới; (d) chứng nhận ISO; (e) website (Tier-1 Sự hiện diện số cơ bản); (f) FDI ≥10% (cơ cấu sở hữu). Chiều thứ tư phản ánh</w:t>
+        <w:t xml:space="preserve">. Biến đo lường: (a) R&amp;D (tỷ lệ doanh nghiệp có chi tiêu R&amp;D dương); (b) đổi mới sản phẩm mới; (c) đổi mới quy trình mới; (d) chứng nhận ISO; (e) website (Bậc 1 Sự hiện diện số cơ bản); (f) FDI ≥10% (cơ cấu sở hữu). Chiều thứ tư phản ánh</w:t>
       </w:r>
       <w:r>
         <w:t xml:space="preserve"> </w:t>
@@ -5827,13 +5852,13 @@
           <w:bCs/>
           <w:b/>
         </w:rPr>
-        <w:t xml:space="preserve">68 nghiên cứu</w:t>
-      </w:r>
-      <w:r>
-        <w:t xml:space="preserve"> </w:t>
-      </w:r>
-      <w:r>
-        <w:t xml:space="preserve">giai đoạn 1980–2005. Hệ số tương quan trung bình r=0,045, tích cực nhưng nhỏ. Phát hiện chính: đo lường quốc tế hóa và hiệu quả rất không đồng nhất giữa các nghiên cứu, hạn chế khả năng so sánh. Khoảng trống: ít nghiên cứu châu Á mới nổi.</w:t>
+        <w:t xml:space="preserve">36 nghiên cứu</w:t>
+      </w:r>
+      <w:r>
+        <w:t xml:space="preserve"> </w:t>
+      </w:r>
+      <w:r>
+        <w:t xml:space="preserve">(41 mẫu) giai đoạn 1980–2005. Hệ số tương quan trung bình dương nhưng nhỏ. Phát hiện chính: đo lường quốc tế hóa và hiệu quả rất không đồng nhất giữa các nghiên cứu, hạn chế khả năng so sánh. Khoảng trống: ít nghiên cứu châu Á mới nổi.</w:t>
       </w:r>
     </w:p>
     <w:p>
@@ -5858,13 +5883,13 @@
           <w:bCs/>
           <w:b/>
         </w:rPr>
-        <w:t xml:space="preserve">154 mẫu</w:t>
-      </w:r>
-      <w:r>
-        <w:t xml:space="preserve"> </w:t>
-      </w:r>
-      <w:r>
-        <w:t xml:space="preserve">với phân tích điều tiết phân tích tổng hợp. Phát hiện: quan hệ quốc tế hóa – hiệu quả dương và có ý nghĩa thống kê; nhưng bị điều tiết bởi loại doanh nghiệp, phương thức đo lường, bối cảnh quốc gia. Quan trọng: các doanh nghiệp châu Á và các nền kinh tế mới nổi biểu hiện khuôn mẫu khác biệt so với doanh nghiệp OECD.</w:t>
+        <w:t xml:space="preserve">152 mẫu</w:t>
+      </w:r>
+      <w:r>
+        <w:t xml:space="preserve"> </w:t>
+      </w:r>
+      <w:r>
+        <w:t xml:space="preserve">(141 nghiên cứu) với phân tích điều tiết phân tích tổng hợp. Phát hiện: quan hệ quốc tế hóa – hiệu quả dương và có ý nghĩa thống kê; nhưng bị điều tiết bởi loại doanh nghiệp, phương thức đo lường, bối cảnh quốc gia. Quan trọng: các doanh nghiệp châu Á và các nền kinh tế mới nổi biểu hiện khuôn mẫu khác biệt so với doanh nghiệp OECD.</w:t>
       </w:r>
     </w:p>
     <w:p>
@@ -5879,7 +5904,7 @@
         <w:t xml:space="preserve">(3) Marano et al. (2016)</w:t>
       </w:r>
       <w:r>
-        <w:t xml:space="preserve">: Tập trung vào thể chế hóa nghiên cứu quốc tế hóa – hiệu quả. Phát hiện: chất lượng thể chế nước chủ nhà là biến điều tiết quan trọng nhất, giải thích phần lớn phương sai không giải thích được trong các phân tích tổng hợp trước. Đặt nền tảng cho khung ICRV trong chuyên đề này.</w:t>
+        <w:t xml:space="preserve">: Tập trung vào thể chế hóa nghiên cứu quốc tế hóa – hiệu quả. Phát hiện: chất lượng thể chế nước chủ nhà là biến điều tiết quan trọng nhất, giải thích phần lớn phương sai không giải thích được trong các phân tích tổng hợp trước. Đặt nền tảng cho khung ICRV trong chuyên đề này. Bổ sung cho hướng này, Beugelsdijk et al. (2018), qua một phân tích tổng hợp về khoảng cách văn hóa và quá trình quốc tế hóa của doanh nghiệp, cho thấy hệ quả của quốc tế hóa thay đổi một cách hệ thống theo khoảng cách văn hóa và thể chế giữa thị trường nguồn và thị trường đích, củng cố nền tảng lý thuyết cho việc phân nhóm theo phổ thể chế ICRV sáu nhóm.</w:t>
       </w:r>
     </w:p>
     <w:p>
@@ -5906,7 +5931,7 @@
           <w:bCs/>
           <w:b/>
         </w:rPr>
-        <w:t xml:space="preserve">(5) Wu, Xu và Yang (2022)</w:t>
+        <w:t xml:space="preserve">(5) Wu, Wood và Khan (2022)</w:t>
       </w:r>
       <w:r>
         <w:t xml:space="preserve">: Cập nhật phân tích tổng hợp đến 2020, tập trung vào</w:t>
@@ -5937,7 +5962,7 @@
         <w:t xml:space="preserve">Khoảng trống từ 5 meta-analyses</w:t>
       </w:r>
       <w:r>
-        <w:t xml:space="preserve">: Không một phân tích tổng hợp nào trong số trên có dữ liệu WBES xuyên 50 nền kinh tế với phân loại ICRV 6 nhóm. Không có nghiên cứu nào phân biệt tường minh Tầng 1 và Tầng 2 áp dụng số như biến điều tiết riêng biệt. Khoảng trống này là nền tảng cho phần thảo luận về các khoảng trống nghiên cứu trong mục 2.3.9.</w:t>
+        <w:t xml:space="preserve">: Không một phân tích tổng hợp nào trong số trên có dữ liệu WBES xuyên 50 nền kinh tế với phân loại ICRV 6 nhóm. Không có nghiên cứu nào phân biệt tường minh Bậc 1 và Bậc 2 áp dụng số như biến điều tiết riêng biệt. Khoảng trống này là nền tảng cho phần thảo luận về các khoảng trống nghiên cứu trong mục 2.3.9.</w:t>
       </w:r>
     </w:p>
     <w:bookmarkEnd w:id="38"/>
@@ -5986,7 +6011,7 @@
         <w:t xml:space="preserve">lộ trình tiệm tiến</w:t>
       </w:r>
       <w:r>
-        <w:t xml:space="preserve">, bắt đầu từ các thị trường gần về tâm lý rồi mở rộng dần. Phiên bản 2009 cập nhật: mạng lưới quan hệ kinh doanh thay thế khoảng cách tâm lý như cơ chế dẫn dắt. Hàm ý cho chuyên đề: (a) khuôn mẫu FSTS thấp ở SIDS Pacific (6,3%) và FSTS cao liên kết FDI ở Việt Nam (23,2%) phù hợp với đường cong học hỏi Uppsala; (b) các công cụ số theo Banalieva &amp; Dhanaraj (2019) có thể rút ngắn lộ trình tiệm tiến ở giai đoạn đầu, nhưng cần Tầng 2 để phát huy đầy đủ.</w:t>
+        <w:t xml:space="preserve">, bắt đầu từ các thị trường gần về tâm lý rồi mở rộng dần. Phiên bản 2009 cập nhật: mạng lưới quan hệ kinh doanh thay thế khoảng cách tâm lý như cơ chế dẫn dắt. Hàm ý cho chuyên đề: (a) khuôn mẫu FSTS thấp ở SIDS Pacific (6,3%) và FSTS cao liên kết FDI ở Việt Nam (23,2%) phù hợp với đường cong học hỏi Uppsala; (b) các công cụ số theo Banalieva &amp; Dhanaraj (2019) có thể rút ngắn lộ trình tiệm tiến ở giai đoạn đầu, nhưng cần Bậc 2 để phát huy đầy đủ.</w:t>
       </w:r>
     </w:p>
     <w:p>
@@ -6513,7 +6538,7 @@
               <w:jc w:val="center"/>
             </w:pPr>
             <w:r>
-              <w:t xml:space="preserve">✗</w:t>
+              <w:t xml:space="preserve">Không</w:t>
             </w:r>
           </w:p>
         </w:tc>
@@ -6544,13 +6569,13 @@
       </w:tr>
     </w:tbl>
     <w:bookmarkEnd w:id="40"/>
-    <w:bookmarkStart w:id="41" w:name="X095aaec1a623b630743abb29fda2315c3c0a6ca"/>
+    <w:bookmarkStart w:id="41" w:name="X4ca83cf2abcff6a48f6b1f7c0413cca47df7dba"/>
     <w:p>
       <w:pPr>
         <w:pStyle w:val="Heading4"/>
       </w:pPr>
       <w:r>
-        <w:t xml:space="preserve">2.3.1.6 Khung 4 Tầng chuyển đổi số và Mô hình CDCM</w:t>
+        <w:t xml:space="preserve">2.3.1.6 Khung 4 Bậc chuyển đổi số và Mô hình CDCM</w:t>
       </w:r>
     </w:p>
     <w:p>
@@ -6562,7 +6587,7 @@
           <w:bCs/>
           <w:b/>
         </w:rPr>
-        <w:t xml:space="preserve">Bốn tầng bậc số hóa theo Verhoef et al. (2021)</w:t>
+        <w:t xml:space="preserve">Bốn bậc số hóa theo Verhoef et al. (2021)</w:t>
       </w:r>
       <w:r>
         <w:t xml:space="preserve">:</w:t>
@@ -6593,7 +6618,7 @@
               <w:jc w:val="left"/>
             </w:pPr>
             <w:r>
-              <w:t xml:space="preserve">Tầng</w:t>
+              <w:t xml:space="preserve">Bậc</w:t>
             </w:r>
           </w:p>
         </w:tc>
@@ -6647,7 +6672,7 @@
                 <w:bCs/>
                 <w:b/>
               </w:rPr>
-              <w:t xml:space="preserve">Tier 1</w:t>
+              <w:t xml:space="preserve">Bậc 1</w:t>
             </w:r>
           </w:p>
         </w:tc>
@@ -6701,7 +6726,7 @@
                 <w:bCs/>
                 <w:b/>
               </w:rPr>
-              <w:t xml:space="preserve">Tier 2</w:t>
+              <w:t xml:space="preserve">Bậc 2</w:t>
             </w:r>
           </w:p>
         </w:tc>
@@ -6755,7 +6780,7 @@
                 <w:bCs/>
                 <w:b/>
               </w:rPr>
-              <w:t xml:space="preserve">Tier 3</w:t>
+              <w:t xml:space="preserve">Bậc 3</w:t>
             </w:r>
           </w:p>
         </w:tc>
@@ -6809,7 +6834,7 @@
                 <w:bCs/>
                 <w:b/>
               </w:rPr>
-              <w:t xml:space="preserve">Tier 4</w:t>
+              <w:t xml:space="preserve">Bậc 4</w:t>
             </w:r>
           </w:p>
         </w:tc>
@@ -6863,7 +6888,7 @@
         <w:t xml:space="preserve">Tuyên bố ranh giới đo lường</w:t>
       </w:r>
       <w:r>
-        <w:t xml:space="preserve">: Dữ liệu WBES của chuyên đề (khung phân tích 88.869 DN / 50 nền, gồm Nhật Bản, dùng chung cho mô tả và ước lượng P7) quan sát Tầng 1–2, không Tầng 3–4. Mọi lập luận về</w:t>
+        <w:t xml:space="preserve">: Dữ liệu WBES của chuyên đề (khung phân tích 88.869 DN / 50 nền, gồm Nhật Bản, dùng chung cho mô tả và ước lượng P7) quan sát Bậc 1–2, không Bậc 3–4. Mọi lập luận về</w:t>
       </w:r>
       <w:r>
         <w:t xml:space="preserve"> </w:t>
@@ -6955,7 +6980,7 @@
         <w:t xml:space="preserve">(b) Cơ chế DAI</w:t>
       </w:r>
       <w:r>
-        <w:t xml:space="preserve">: Việt Nam (Tier 1 = website only) sang</w:t>
+        <w:t xml:space="preserve">: Việt Nam (Bậc 1 = website only) sang</w:t>
       </w:r>
       <w:r>
         <w:t xml:space="preserve"> </w:t>
@@ -6968,7 +6993,66 @@
         <w:t xml:space="preserve">phụ thuộc giai đoạn</w:t>
       </w:r>
       <w:r>
-        <w:t xml:space="preserve">: tương tác DAI×FSTS âm ở FSTS cao, Tầng 1 trở thành điểm nghẽn. Singapore (Tier 1+2) sang</w:t>
+        <w:t xml:space="preserve">: tương tác</w:t>
+      </w:r>
+      <w:r>
+        <w:t xml:space="preserve"> </w:t>
+      </w:r>
+      <m:oMath>
+        <m:r>
+          <m:rPr>
+            <m:sty m:val="p"/>
+          </m:rPr>
+          <m:t>D</m:t>
+        </m:r>
+        <m:r>
+          <m:rPr>
+            <m:sty m:val="p"/>
+          </m:rPr>
+          <m:t>A</m:t>
+        </m:r>
+        <m:r>
+          <m:rPr>
+            <m:sty m:val="p"/>
+          </m:rPr>
+          <m:t>I</m:t>
+        </m:r>
+        <m:r>
+          <m:rPr>
+            <m:sty m:val="p"/>
+          </m:rPr>
+          <m:t>×</m:t>
+        </m:r>
+        <m:r>
+          <m:rPr>
+            <m:sty m:val="p"/>
+          </m:rPr>
+          <m:t>F</m:t>
+        </m:r>
+        <m:r>
+          <m:rPr>
+            <m:sty m:val="p"/>
+          </m:rPr>
+          <m:t>S</m:t>
+        </m:r>
+        <m:r>
+          <m:rPr>
+            <m:sty m:val="p"/>
+          </m:rPr>
+          <m:t>T</m:t>
+        </m:r>
+        <m:r>
+          <m:rPr>
+            <m:sty m:val="p"/>
+          </m:rPr>
+          <m:t>S</m:t>
+        </m:r>
+      </m:oMath>
+      <w:r>
+        <w:t xml:space="preserve"> </w:t>
+      </w:r>
+      <w:r>
+        <w:t xml:space="preserve">âm ở FSTS cao, Bậc 1 trở thành điểm nghẽn. Singapore (Bậc 1+2) sang</w:t>
       </w:r>
       <w:r>
         <w:t xml:space="preserve"> </w:t>
@@ -6981,7 +7065,130 @@
         <w:t xml:space="preserve">mở rộng có điều kiện</w:t>
       </w:r>
       <w:r>
-        <w:t xml:space="preserve">: tương tác DAI×FSTS² dương mạnh (β=3,119, p=0,005), Tầng 1+2 là đòn bẩy.</w:t>
+        <w:t xml:space="preserve">: tương tác</w:t>
+      </w:r>
+      <w:r>
+        <w:t xml:space="preserve"> </w:t>
+      </w:r>
+      <m:oMath>
+        <m:r>
+          <m:rPr>
+            <m:sty m:val="p"/>
+          </m:rPr>
+          <m:t>D</m:t>
+        </m:r>
+        <m:r>
+          <m:rPr>
+            <m:sty m:val="p"/>
+          </m:rPr>
+          <m:t>A</m:t>
+        </m:r>
+        <m:r>
+          <m:rPr>
+            <m:sty m:val="p"/>
+          </m:rPr>
+          <m:t>I</m:t>
+        </m:r>
+        <m:r>
+          <m:rPr>
+            <m:sty m:val="p"/>
+          </m:rPr>
+          <m:t>×</m:t>
+        </m:r>
+        <m:sSup>
+          <m:e>
+            <m:r>
+              <m:rPr>
+                <m:sty m:val="p"/>
+              </m:rPr>
+              <m:t>F</m:t>
+            </m:r>
+            <m:r>
+              <m:rPr>
+                <m:sty m:val="p"/>
+              </m:rPr>
+              <m:t>S</m:t>
+            </m:r>
+            <m:r>
+              <m:rPr>
+                <m:sty m:val="p"/>
+              </m:rPr>
+              <m:t>T</m:t>
+            </m:r>
+            <m:r>
+              <m:rPr>
+                <m:sty m:val="p"/>
+              </m:rPr>
+              <m:t>S</m:t>
+            </m:r>
+          </m:e>
+          <m:sup>
+            <m:r>
+              <m:t>2</m:t>
+            </m:r>
+          </m:sup>
+        </m:sSup>
+      </m:oMath>
+      <w:r>
+        <w:t xml:space="preserve"> </w:t>
+      </w:r>
+      <w:r>
+        <w:t xml:space="preserve">dương mạnh (</w:t>
+      </w:r>
+      <m:oMath>
+        <m:r>
+          <m:t>β</m:t>
+        </m:r>
+        <m:r>
+          <m:rPr>
+            <m:sty m:val="p"/>
+          </m:rPr>
+          <m:t>=</m:t>
+        </m:r>
+        <m:r>
+          <m:t>3</m:t>
+        </m:r>
+        <m:r>
+          <m:rPr>
+            <m:sty m:val="p"/>
+          </m:rPr>
+          <m:t>,</m:t>
+        </m:r>
+        <m:r>
+          <m:t>119</m:t>
+        </m:r>
+      </m:oMath>
+      <w:r>
+        <w:t xml:space="preserve">,</w:t>
+      </w:r>
+      <w:r>
+        <w:t xml:space="preserve"> </w:t>
+      </w:r>
+      <m:oMath>
+        <m:r>
+          <m:t>p</m:t>
+        </m:r>
+        <m:r>
+          <m:rPr>
+            <m:sty m:val="p"/>
+          </m:rPr>
+          <m:t>=</m:t>
+        </m:r>
+        <m:r>
+          <m:t>0</m:t>
+        </m:r>
+        <m:r>
+          <m:rPr>
+            <m:sty m:val="p"/>
+          </m:rPr>
+          <m:t>,</m:t>
+        </m:r>
+        <m:r>
+          <m:t>005</m:t>
+        </m:r>
+      </m:oMath>
+      <w:r>
+        <w:t xml:space="preserve">), Bậc 1+2 là đòn bẩy.</w:t>
       </w:r>
     </w:p>
     <w:p>
@@ -7012,7 +7219,65 @@
         <w:t xml:space="preserve"> </w:t>
       </w:r>
       <w:r>
-        <w:t xml:space="preserve">(TCI z biến công cụ β=1,639, p&lt;0,001, ước lượng 2SLS vững). Singapore,</w:t>
+        <w:t xml:space="preserve">(TCI z biến công cụ</w:t>
+      </w:r>
+      <w:r>
+        <w:t xml:space="preserve"> </w:t>
+      </w:r>
+      <m:oMath>
+        <m:r>
+          <m:t>β</m:t>
+        </m:r>
+        <m:r>
+          <m:rPr>
+            <m:sty m:val="p"/>
+          </m:rPr>
+          <m:t>=</m:t>
+        </m:r>
+        <m:r>
+          <m:t>1</m:t>
+        </m:r>
+        <m:r>
+          <m:rPr>
+            <m:sty m:val="p"/>
+          </m:rPr>
+          <m:t>,</m:t>
+        </m:r>
+        <m:r>
+          <m:t>639</m:t>
+        </m:r>
+      </m:oMath>
+      <w:r>
+        <w:t xml:space="preserve">,</w:t>
+      </w:r>
+      <w:r>
+        <w:t xml:space="preserve"> </w:t>
+      </w:r>
+      <m:oMath>
+        <m:r>
+          <m:t>p</m:t>
+        </m:r>
+        <m:r>
+          <m:rPr>
+            <m:sty m:val="p"/>
+          </m:rPr>
+          <m:t>&lt;</m:t>
+        </m:r>
+        <m:r>
+          <m:t>0</m:t>
+        </m:r>
+        <m:r>
+          <m:rPr>
+            <m:sty m:val="p"/>
+          </m:rPr>
+          <m:t>,</m:t>
+        </m:r>
+        <m:r>
+          <m:t>001</m:t>
+        </m:r>
+      </m:oMath>
+      <w:r>
+        <w:t xml:space="preserve">, ước lượng 2SLS vững). Singapore,</w:t>
       </w:r>
       <w:r>
         <w:t xml:space="preserve"> </w:t>
@@ -8933,7 +9198,7 @@
         <w:t xml:space="preserve">d3b + d3c</w:t>
       </w:r>
       <w:r>
-        <w:t xml:space="preserve">; winsorize log năng suất ở mức 1/99 phân vị trong cụm quốc gia × năm.</w:t>
+        <w:t xml:space="preserve">; cắt đuôi (winsorize) log năng suất ở mức 1/99 phân vị trong cụm quốc gia × năm.</w:t>
       </w:r>
     </w:p>
     <w:bookmarkEnd w:id="54"/>
@@ -9768,7 +10033,7 @@
         <w:t xml:space="preserve">0,50 (Nhóm I) rồi 0,45 (III) rồi 0,35 (IV)</w:t>
       </w:r>
       <w:r>
-        <w:t xml:space="preserve">; Nhóm V–VI có outlier mạnh nên chỉ đọc trung vị (V≈0,41; VI≈0,47), thể chế yếu đi kèm biên lợi nhuận mỏng hơn, nhất quán với Lý thuyết thể chế (chi phí giao dịch cao bào mòn biên). (3) Suy diễn về</w:t>
+        <w:t xml:space="preserve">; Nhóm V–VI có giá trị ngoại lai mạnh nên chỉ đọc trung vị (V≈0,41; VI≈0,47), thể chế yếu đi kèm biên lợi nhuận mỏng hơn, nhất quán với Lý thuyết thể chế (chi phí giao dịch cao bào mòn biên). (3) Suy diễn về</w:t>
       </w:r>
       <w:r>
         <w:t xml:space="preserve"> </w:t>
@@ -11438,13 +11703,13 @@
       </w:r>
     </w:p>
     <w:bookmarkEnd w:id="62"/>
-    <w:bookmarkStart w:id="63" w:name="Xdbf03bfe856aa219791dbd3c40b9a33c42291cb"/>
+    <w:bookmarkStart w:id="63" w:name="Xaa05f2cc69387f8da77f0f5da9ec0329380f0a1"/>
     <w:p>
       <w:pPr>
         <w:pStyle w:val="Heading4"/>
       </w:pPr>
       <w:r>
-        <w:t xml:space="preserve">2.3.4.3 Tái định hình Chỉ số áp dụng số: Tầng 1 Sự hiện diện số cơ bản</w:t>
+        <w:t xml:space="preserve">2.3.4.3 Tái định hình Chỉ số áp dụng số: Bậc 1 Sự hiện diện số cơ bản</w:t>
       </w:r>
     </w:p>
     <w:p>
@@ -11493,7 +11758,7 @@
           <w:bCs/>
           <w:b/>
         </w:rPr>
-        <w:t xml:space="preserve">giới hạn của thước đo Tier-1</w:t>
+        <w:t xml:space="preserve">giới hạn của thước đo Bậc 1</w:t>
       </w:r>
       <w:r>
         <w:t xml:space="preserve"> </w:t>
@@ -11549,7 +11814,7 @@
           <w:bCs/>
           <w:b/>
         </w:rPr>
-        <w:t xml:space="preserve">Sự hiện diện số cơ bản (Tier-1)</w:t>
+        <w:t xml:space="preserve">Sự hiện diện số cơ bản (Bậc 1)</w:t>
       </w:r>
       <w:r>
         <w:rPr>
@@ -11617,7 +11882,7 @@
     <w:tbl>
       <w:tblPr>
         <w:tblStyle w:val="Table"/>
-        <w:tblW w:type="auto" w:w="0"/>
+        <w:tblW w:type="pct" w:w="5000"/>
         <w:tblLook w:firstRow="1" w:lastRow="0" w:firstColumn="0" w:lastColumn="0" w:noHBand="0" w:noVBand="0" w:val="0020"/>
         <w:jc w:val="start"/>
       </w:tblPr>
@@ -11675,7 +11940,24 @@
               <w:jc w:val="left"/>
             </w:pPr>
             <w:r>
-              <w:t xml:space="preserve">FDI ≥10%</w:t>
+              <w:t xml:space="preserve">FDI</w:t>
+            </w:r>
+            <w:r>
+              <w:t xml:space="preserve"> </w:t>
+            </w:r>
+            <m:oMath>
+              <m:r>
+                <m:rPr>
+                  <m:sty m:val="p"/>
+                </m:rPr>
+                <m:t>≥</m:t>
+              </m:r>
+            </m:oMath>
+            <w:r>
+              <w:t xml:space="preserve"> </w:t>
+            </w:r>
+            <w:r>
+              <w:t xml:space="preserve">10%</w:t>
             </w:r>
           </w:p>
         </w:tc>
@@ -12688,7 +12970,7 @@
     <w:tbl>
       <w:tblPr>
         <w:tblStyle w:val="Table"/>
-        <w:tblW w:type="auto" w:w="0"/>
+        <w:tblW w:type="pct" w:w="5000"/>
         <w:tblLook w:firstRow="1" w:lastRow="0" w:firstColumn="0" w:lastColumn="0" w:noHBand="0" w:noVBand="0" w:val="0020"/>
         <w:jc w:val="start"/>
       </w:tblPr>
@@ -12723,8 +13005,16 @@
               <w:pStyle w:val="Compact"/>
               <w:jc w:val="right"/>
             </w:pPr>
-            <w:r>
-              <w:t xml:space="preserve">Δ Website</w:t>
+            <m:oMath>
+              <m:r>
+                <m:t>Δ</m:t>
+              </m:r>
+            </m:oMath>
+            <w:r>
+              <w:t xml:space="preserve"> </w:t>
+            </w:r>
+            <w:r>
+              <w:t xml:space="preserve">Website</w:t>
             </w:r>
           </w:p>
         </w:tc>
@@ -12735,8 +13025,16 @@
               <w:pStyle w:val="Compact"/>
               <w:jc w:val="right"/>
             </w:pPr>
-            <w:r>
-              <w:t xml:space="preserve">Δ DN xuất khẩu</w:t>
+            <m:oMath>
+              <m:r>
+                <m:t>Δ</m:t>
+              </m:r>
+            </m:oMath>
+            <w:r>
+              <w:t xml:space="preserve"> </w:t>
+            </w:r>
+            <w:r>
+              <w:t xml:space="preserve">DN xuất khẩu</w:t>
             </w:r>
           </w:p>
         </w:tc>
@@ -12747,8 +13045,33 @@
               <w:pStyle w:val="Compact"/>
               <w:jc w:val="right"/>
             </w:pPr>
-            <w:r>
-              <w:t xml:space="preserve">Δ FDI ≥10%</w:t>
+            <m:oMath>
+              <m:r>
+                <m:t>Δ</m:t>
+              </m:r>
+            </m:oMath>
+            <w:r>
+              <w:t xml:space="preserve"> </w:t>
+            </w:r>
+            <w:r>
+              <w:t xml:space="preserve">FDI</w:t>
+            </w:r>
+            <w:r>
+              <w:t xml:space="preserve"> </w:t>
+            </w:r>
+            <m:oMath>
+              <m:r>
+                <m:rPr>
+                  <m:sty m:val="p"/>
+                </m:rPr>
+                <m:t>≥</m:t>
+              </m:r>
+            </m:oMath>
+            <w:r>
+              <w:t xml:space="preserve"> </w:t>
+            </w:r>
+            <w:r>
+              <w:t xml:space="preserve">10%</w:t>
             </w:r>
           </w:p>
         </w:tc>
@@ -12759,8 +13082,16 @@
               <w:pStyle w:val="Compact"/>
               <w:jc w:val="right"/>
             </w:pPr>
-            <w:r>
-              <w:t xml:space="preserve">Δ R&amp;D</w:t>
+            <m:oMath>
+              <m:r>
+                <m:t>Δ</m:t>
+              </m:r>
+            </m:oMath>
+            <w:r>
+              <w:t xml:space="preserve"> </w:t>
+            </w:r>
+            <w:r>
+              <w:t xml:space="preserve">R&amp;D</w:t>
             </w:r>
           </w:p>
         </w:tc>
@@ -12771,8 +13102,16 @@
               <w:pStyle w:val="Compact"/>
               <w:jc w:val="right"/>
             </w:pPr>
-            <w:r>
-              <w:t xml:space="preserve">Δ ISO</w:t>
+            <m:oMath>
+              <m:r>
+                <m:t>Δ</m:t>
+              </m:r>
+            </m:oMath>
+            <w:r>
+              <w:t xml:space="preserve"> </w:t>
+            </w:r>
+            <w:r>
+              <w:t xml:space="preserve">ISO</w:t>
             </w:r>
           </w:p>
         </w:tc>
@@ -14496,7 +14835,24 @@
               <w:jc w:val="right"/>
             </w:pPr>
             <w:r>
-              <w:t xml:space="preserve">FDI ≥10% (%)</w:t>
+              <w:t xml:space="preserve">FDI</w:t>
+            </w:r>
+            <w:r>
+              <w:t xml:space="preserve"> </w:t>
+            </w:r>
+            <m:oMath>
+              <m:r>
+                <m:rPr>
+                  <m:sty m:val="p"/>
+                </m:rPr>
+                <m:t>≥</m:t>
+              </m:r>
+            </m:oMath>
+            <w:r>
+              <w:t xml:space="preserve"> </w:t>
+            </w:r>
+            <w:r>
+              <w:t xml:space="preserve">10% (%)</w:t>
             </w:r>
           </w:p>
         </w:tc>
@@ -16798,7 +17154,7 @@
           <w:iCs/>
           <w:i/>
         </w:rPr>
-        <w:t xml:space="preserve">, 22,6% dùng máy tính/tablet), bộ công cụ không tương đương với cross-section chuẩn nên không thuộc mẫu gộp mô tả và chỉ nêu ở đây như tham chiếu.</w:t>
+        <w:t xml:space="preserve">, 22,6% dùng máy tính/tablet), bộ công cụ không tương đương với lát cắt ngang chuẩn nên không thuộc mẫu gộp mô tả và chỉ nêu ở đây như tham chiếu.</w:t>
       </w:r>
     </w:p>
     <w:p>
@@ -17021,7 +17377,7 @@
         <w:pStyle w:val="BodyText"/>
       </w:pPr>
       <w:r>
-        <w:t xml:space="preserve">Hệ sinh thái Singapore vận hành ở Tầng 3–4, vượt xa lớp DAI Tầng 1–2 đo trong WBES. Đây là lý do</w:t>
+        <w:t xml:space="preserve">Hệ sinh thái Singapore vận hành ở Bậc 3–4, vượt xa lớp DAI Bậc 1–2 đo trong WBES. Đây là lý do</w:t>
       </w:r>
       <w:r>
         <w:t xml:space="preserve"> </w:t>
@@ -17204,7 +17560,24 @@
               <w:jc w:val="left"/>
             </w:pPr>
             <w:r>
-              <w:t xml:space="preserve">FDI ≥10% (%)</w:t>
+              <w:t xml:space="preserve">FDI</w:t>
+            </w:r>
+            <w:r>
+              <w:t xml:space="preserve"> </w:t>
+            </w:r>
+            <m:oMath>
+              <m:r>
+                <m:rPr>
+                  <m:sty m:val="p"/>
+                </m:rPr>
+                <m:t>≥</m:t>
+              </m:r>
+            </m:oMath>
+            <w:r>
+              <w:t xml:space="preserve"> </w:t>
+            </w:r>
+            <w:r>
+              <w:t xml:space="preserve">10% (%)</w:t>
             </w:r>
           </w:p>
         </w:tc>
@@ -17625,7 +17998,7 @@
         <w:t xml:space="preserve">Asian Development Review, 43</w:t>
       </w:r>
       <w:r>
-        <w:t xml:space="preserve">(1), 37–75), panel 4.293 doanh nghiệp Ấn Độ 2006–2019: FDI là kênh lan tỏa ngang quan trọng nhất; doanh nghiệp lớn thu nhận lan tỏa nhiều hơn; FDI tăng từ 1,705 triệu USD (1990–2000) rồi 42,396 triệu USD (2012–2022); R&amp;D trì trệ ở 0,7% GDP.</w:t>
+        <w:t xml:space="preserve">(1), 37–75), dữ liệu bảng 4.293 doanh nghiệp Ấn Độ 2006–2019: FDI là kênh lan tỏa ngang quan trọng nhất; doanh nghiệp lớn thu nhận lan tỏa nhiều hơn; FDI tăng từ 1,705 triệu USD (1990–2000) rồi 42,396 triệu USD (2012–2022); R&amp;D trì trệ ở 0,7% GDP.</w:t>
       </w:r>
     </w:p>
     <w:bookmarkEnd w:id="87"/>
@@ -18268,7 +18641,24 @@
               <w:jc w:val="left"/>
             </w:pPr>
             <w:r>
-              <w:t xml:space="preserve">FDI ≥10% (%)</w:t>
+              <w:t xml:space="preserve">FDI</w:t>
+            </w:r>
+            <w:r>
+              <w:t xml:space="preserve"> </w:t>
+            </w:r>
+            <m:oMath>
+              <m:r>
+                <m:rPr>
+                  <m:sty m:val="p"/>
+                </m:rPr>
+                <m:t>≥</m:t>
+              </m:r>
+            </m:oMath>
+            <w:r>
+              <w:t xml:space="preserve"> </w:t>
+            </w:r>
+            <w:r>
+              <w:t xml:space="preserve">10% (%)</w:t>
             </w:r>
           </w:p>
         </w:tc>
@@ -18870,7 +19260,24 @@
               <w:jc w:val="left"/>
             </w:pPr>
             <w:r>
-              <w:t xml:space="preserve">FDI ≥ 10%</w:t>
+              <w:t xml:space="preserve">FDI</w:t>
+            </w:r>
+            <w:r>
+              <w:t xml:space="preserve"> </w:t>
+            </w:r>
+            <m:oMath>
+              <m:r>
+                <m:rPr>
+                  <m:sty m:val="p"/>
+                </m:rPr>
+                <m:t>≥</m:t>
+              </m:r>
+            </m:oMath>
+            <w:r>
+              <w:t xml:space="preserve"> </w:t>
+            </w:r>
+            <w:r>
+              <w:t xml:space="preserve">10%</w:t>
             </w:r>
           </w:p>
         </w:tc>
@@ -19326,7 +19733,7 @@
         <w:t xml:space="preserve"> </w:t>
       </w:r>
       <w:r>
-        <w:t xml:space="preserve">trong khi cao nhất ở II và IV (+0,202; +0,183), phần bù của hiện diện số Tầng 1 co lại nơi nó đã tiệm cận bão hòa (Nghịch lý bão hòa số ở dạng suy giảm lợi suất biên); (6)</w:t>
+        <w:t xml:space="preserve">trong khi cao nhất ở II và IV (+0,202; +0,183), phần bù của hiện diện số Bậc 1 co lại nơi nó đã tiệm cận bão hòa (Nghịch lý bão hòa số ở dạng suy giảm lợi suất biên); (6)</w:t>
       </w:r>
       <w:r>
         <w:t xml:space="preserve"> </w:t>
@@ -19837,7 +20244,7 @@
         <w:t xml:space="preserve"> </w:t>
       </w:r>
       <w:r>
-        <w:t xml:space="preserve">(năm 1–3): Sụt giảm ngắn hạn do chi phí thiết bị, đào tạo và gián đoạn quy trình. Bằng chứng gián tiếp: phần bù tương quan DAI thấp nhất tại Nhóm Advanced đổi mới (+0,093 so với +0,183–0,202 ở các nhóm chuyển đổi/tài nguyên), nơi Tầng 1 đã tiệm cận bão hòa, lợi suất biên co lại; giai đoạn</w:t>
+        <w:t xml:space="preserve">(năm 1–3): Sụt giảm ngắn hạn do chi phí thiết bị, đào tạo và gián đoạn quy trình. Bằng chứng gián tiếp: phần bù tương quan DAI thấp nhất tại Nhóm Advanced đổi mới (+0,093 so với +0,183–0,202 ở các nhóm chuyển đổi/tài nguyên), nơi Bậc 1 đã tiệm cận bão hòa, lợi suất biên co lại; giai đoạn</w:t>
       </w:r>
       <w:r>
         <w:t xml:space="preserve"> </w:t>
@@ -19891,7 +20298,125 @@
         <w:t xml:space="preserve"> </w:t>
       </w:r>
       <w:r>
-        <w:t xml:space="preserve">(năm 5+): Phần bù năng suất. Bằng chứng: Trung Quốc R&amp;D 39,4% (Tier-2 mature); FSTS²×DAI = +3,119 (p = 0,005) tại Singapore, DAI khuếch đại quan hệ quốc tế hóa – hiệu quả tại doanh nghiệp FSTS cao.</w:t>
+        <w:t xml:space="preserve">(năm 5+): Phần bù năng suất. Bằng chứng: Trung Quốc R&amp;D 39,4% (Bậc 2 mature);</w:t>
+      </w:r>
+      <w:r>
+        <w:t xml:space="preserve"> </w:t>
+      </w:r>
+      <m:oMath>
+        <m:sSup>
+          <m:e>
+            <m:r>
+              <m:rPr>
+                <m:sty m:val="p"/>
+              </m:rPr>
+              <m:t>F</m:t>
+            </m:r>
+            <m:r>
+              <m:rPr>
+                <m:sty m:val="p"/>
+              </m:rPr>
+              <m:t>S</m:t>
+            </m:r>
+            <m:r>
+              <m:rPr>
+                <m:sty m:val="p"/>
+              </m:rPr>
+              <m:t>T</m:t>
+            </m:r>
+            <m:r>
+              <m:rPr>
+                <m:sty m:val="p"/>
+              </m:rPr>
+              <m:t>S</m:t>
+            </m:r>
+          </m:e>
+          <m:sup>
+            <m:r>
+              <m:t>2</m:t>
+            </m:r>
+          </m:sup>
+        </m:sSup>
+        <m:r>
+          <m:rPr>
+            <m:sty m:val="p"/>
+          </m:rPr>
+          <m:t>×</m:t>
+        </m:r>
+        <m:r>
+          <m:rPr>
+            <m:sty m:val="p"/>
+          </m:rPr>
+          <m:t>D</m:t>
+        </m:r>
+        <m:r>
+          <m:rPr>
+            <m:sty m:val="p"/>
+          </m:rPr>
+          <m:t>A</m:t>
+        </m:r>
+        <m:r>
+          <m:rPr>
+            <m:sty m:val="p"/>
+          </m:rPr>
+          <m:t>I</m:t>
+        </m:r>
+        <m:r>
+          <m:rPr>
+            <m:sty m:val="p"/>
+          </m:rPr>
+          <m:t>=</m:t>
+        </m:r>
+        <m:r>
+          <m:rPr>
+            <m:sty m:val="p"/>
+          </m:rPr>
+          <m:t>+</m:t>
+        </m:r>
+        <m:r>
+          <m:t>3</m:t>
+        </m:r>
+        <m:r>
+          <m:rPr>
+            <m:sty m:val="p"/>
+          </m:rPr>
+          <m:t>,</m:t>
+        </m:r>
+        <m:r>
+          <m:t>119</m:t>
+        </m:r>
+      </m:oMath>
+      <w:r>
+        <w:t xml:space="preserve"> </w:t>
+      </w:r>
+      <w:r>
+        <w:t xml:space="preserve">(</w:t>
+      </w:r>
+      <m:oMath>
+        <m:r>
+          <m:t>p</m:t>
+        </m:r>
+        <m:r>
+          <m:rPr>
+            <m:sty m:val="p"/>
+          </m:rPr>
+          <m:t>=</m:t>
+        </m:r>
+        <m:r>
+          <m:t>0</m:t>
+        </m:r>
+        <m:r>
+          <m:rPr>
+            <m:sty m:val="p"/>
+          </m:rPr>
+          <m:t>,</m:t>
+        </m:r>
+        <m:r>
+          <m:t>005</m:t>
+        </m:r>
+      </m:oMath>
+      <w:r>
+        <w:t xml:space="preserve">) tại Singapore, DAI khuếch đại quan hệ quốc tế hóa – hiệu quả tại doanh nghiệp FSTS cao.</w:t>
       </w:r>
     </w:p>
     <w:p>
@@ -19906,7 +20431,7 @@
         <w:t xml:space="preserve">Liên kết CDCM</w:t>
       </w:r>
       <w:r>
-        <w:t xml:space="preserve">: Giai đoạn 1 = proxy cơ chế lỗi thời (DAI Tier-1 bão hòa); Giai đoạn 3 = cơ chế phụ thuộc giai đoạn (DAI Tier-2 có phần bù có điều kiện). Hai cơ chế bổ sung nhau khi kiểm soát thế hệ số.</w:t>
+        <w:t xml:space="preserve">: Giai đoạn 1 = proxy cơ chế lỗi thời (DAI Bậc 1 bão hòa); Giai đoạn 3 = cơ chế phụ thuộc giai đoạn (DAI Bậc 2 có phần bù có điều kiện). Hai cơ chế bổ sung nhau khi kiểm soát thế hệ số.</w:t>
       </w:r>
     </w:p>
     <w:p>
@@ -20065,7 +20590,7 @@
           <w:bCs/>
           <w:b/>
         </w:rPr>
-        <w:t xml:space="preserve">Tier-1 Sự hiện diện số cơ bản</w:t>
+        <w:t xml:space="preserve">Bậc 1 Sự hiện diện số cơ bản</w:t>
       </w:r>
       <w:r>
         <w:t xml:space="preserve"> </w:t>
@@ -20081,13 +20606,13 @@
           <w:bCs/>
           <w:b/>
         </w:rPr>
-        <w:t xml:space="preserve">Tier-2 Chuyển đổi số cơ bản</w:t>
-      </w:r>
-      <w:r>
-        <w:t xml:space="preserve"> </w:t>
-      </w:r>
-      <w:r>
-        <w:t xml:space="preserve">(đang phát triển). Phần bù tương quan DAI thấp nhất ở Nhóm I (+0,093) là dấu hiệu bão hòa Tầng 1, xem kiểm định loại trừ ICT tại Mục 2.3.4.3.</w:t>
+        <w:t xml:space="preserve">Bậc 2 Chuyển đổi số cơ bản</w:t>
+      </w:r>
+      <w:r>
+        <w:t xml:space="preserve"> </w:t>
+      </w:r>
+      <w:r>
+        <w:t xml:space="preserve">(đang phát triển). Phần bù tương quan DAI thấp nhất ở Nhóm I (+0,093) là dấu hiệu bão hòa Bậc 1, xem kiểm định loại trừ ICT tại Mục 2.3.4.3.</w:t>
       </w:r>
     </w:p>
     <w:p>
@@ -20184,7 +20709,7 @@
           <w:bCs/>
           <w:b/>
         </w:rPr>
-        <w:t xml:space="preserve">KT2, Phân nhóm con Advanced: innovation-driven so với resource-driven chưa được hệ thống hóa</w:t>
+        <w:t xml:space="preserve">KT2, Phân nhóm con Advanced: đổi mới dẫn dắt so với tài nguyên dẫn dắt chưa được hệ thống hóa</w:t>
       </w:r>
       <w:r>
         <w:t xml:space="preserve">: Nghiên cứu hiện hành (Bausch &amp; Krist, 2007; Kirca et al., 2012) gộp tất cả OECD vào</w:t>
@@ -20217,7 +20742,7 @@
         <w:t xml:space="preserve">KT3, Xác nhận nhân quả Nghịch lý bão hòa số qua ước lượng biến công cụ</w:t>
       </w:r>
       <w:r>
-        <w:t xml:space="preserve">: Phần bù tương quan DAI suy giảm rõ ở Advanced (+0,093, thấp nhất sáu nhóm) có thể phản ánh: (a) bão hòa thực sự của Tầng 1; (b) nhân quả ngược; (c) bias biến bỏ sót. Biến công cụ hợp lệ (độ phủ băng thông rộng) cần thiết để phân biệt.</w:t>
+        <w:t xml:space="preserve">: Phần bù tương quan DAI suy giảm rõ ở Advanced (+0,093, thấp nhất sáu nhóm) có thể phản ánh: (a) bão hòa thực sự của Bậc 1; (b) nhân quả ngược; (c) bias biến bỏ sót. Biến công cụ hợp lệ (độ phủ băng thông rộng) cần thiết để phân biệt.</w:t>
       </w:r>
     </w:p>
     <w:p>
@@ -20416,7 +20941,7 @@
               <w:jc w:val="left"/>
             </w:pPr>
             <w:r>
-              <w:t xml:space="preserve">Cơ chế innovation-driven và resource-driven khác nhau ra sao trong chuyển hóa quốc tế hóa thành hiệu quả?</w:t>
+              <w:t xml:space="preserve">Cơ chế đổi mới dẫn dắt và tài nguyên dẫn dắt khác nhau ra sao trong chuyển hóa quốc tế hóa thành hiệu quả?</w:t>
             </w:r>
           </w:p>
         </w:tc>
@@ -20578,7 +21103,7 @@
           <w:iCs/>
           <w:i/>
         </w:rPr>
-        <w:t xml:space="preserve">Ghi chú: Bảng này bảo đảm mỗi khoảng trống thực nghiệm rút ra từ bức tranh thực trạng được chuyển thành một câu hỏi nghiên cứu có thiết kế kiểm định cụ thể trong Chuyên đề 2, duy trì tính liên tục logic giữa hai chuyên đề.</w:t>
+        <w:t xml:space="preserve">Ghi chú: Bảng này bảo đảm mỗi khoảng trống thực nghiệm rút ra từ thực trạng được chuyển thành một câu hỏi nghiên cứu có thiết kế kiểm định cụ thể trong Chuyên đề 2, duy trì tính liên tục logic giữa hai chuyên đề.</w:t>
       </w:r>
     </w:p>
     <w:bookmarkEnd w:id="100"/>
@@ -20651,7 +21176,99 @@
         <w:t xml:space="preserve">(3) Giao diện Đổi mới-Hiệu suất Nâng cao (AIPI)</w:t>
       </w:r>
       <w:r>
-        <w:t xml:space="preserve">: FSTS²×DAI = +3,119 tại Singapore gợi ý cơ chế mới, tại FSTS cao, doanh nghiệp cần DAI như</w:t>
+        <w:t xml:space="preserve">:</w:t>
+      </w:r>
+      <w:r>
+        <w:t xml:space="preserve"> </w:t>
+      </w:r>
+      <m:oMath>
+        <m:sSup>
+          <m:e>
+            <m:r>
+              <m:rPr>
+                <m:sty m:val="p"/>
+              </m:rPr>
+              <m:t>F</m:t>
+            </m:r>
+            <m:r>
+              <m:rPr>
+                <m:sty m:val="p"/>
+              </m:rPr>
+              <m:t>S</m:t>
+            </m:r>
+            <m:r>
+              <m:rPr>
+                <m:sty m:val="p"/>
+              </m:rPr>
+              <m:t>T</m:t>
+            </m:r>
+            <m:r>
+              <m:rPr>
+                <m:sty m:val="p"/>
+              </m:rPr>
+              <m:t>S</m:t>
+            </m:r>
+          </m:e>
+          <m:sup>
+            <m:r>
+              <m:t>2</m:t>
+            </m:r>
+          </m:sup>
+        </m:sSup>
+        <m:r>
+          <m:rPr>
+            <m:sty m:val="p"/>
+          </m:rPr>
+          <m:t>×</m:t>
+        </m:r>
+        <m:r>
+          <m:rPr>
+            <m:sty m:val="p"/>
+          </m:rPr>
+          <m:t>D</m:t>
+        </m:r>
+        <m:r>
+          <m:rPr>
+            <m:sty m:val="p"/>
+          </m:rPr>
+          <m:t>A</m:t>
+        </m:r>
+        <m:r>
+          <m:rPr>
+            <m:sty m:val="p"/>
+          </m:rPr>
+          <m:t>I</m:t>
+        </m:r>
+        <m:r>
+          <m:rPr>
+            <m:sty m:val="p"/>
+          </m:rPr>
+          <m:t>=</m:t>
+        </m:r>
+        <m:r>
+          <m:rPr>
+            <m:sty m:val="p"/>
+          </m:rPr>
+          <m:t>+</m:t>
+        </m:r>
+        <m:r>
+          <m:t>3</m:t>
+        </m:r>
+        <m:r>
+          <m:rPr>
+            <m:sty m:val="p"/>
+          </m:rPr>
+          <m:t>,</m:t>
+        </m:r>
+        <m:r>
+          <m:t>119</m:t>
+        </m:r>
+      </m:oMath>
+      <w:r>
+        <w:t xml:space="preserve"> </w:t>
+      </w:r>
+      <w:r>
+        <w:t xml:space="preserve">tại Singapore gợi ý cơ chế mới, tại FSTS cao, doanh nghiệp cần DAI như</w:t>
       </w:r>
       <w:r>
         <w:t xml:space="preserve"> </w:t>
@@ -20684,7 +21301,7 @@
         <w:t xml:space="preserve">(4) Sân khấu số là thực tế đo lường ở cả hai chiều</w:t>
       </w:r>
       <w:r>
-        <w:t xml:space="preserve">: Tại Advanced, DAI Tầng 1 là yếu tố vệ sinh bão hòa. Tại Emerging, DAI Tầng 1 có thể là proxy lỗi thời, đo lường không còn phản ánh được cơ chế kinh tế thực.</w:t>
+        <w:t xml:space="preserve">: Tại Advanced, DAI Bậc 1 là yếu tố vệ sinh bão hòa. Tại Emerging, DAI Bậc 1 có thể là proxy lỗi thời, đo lường không còn phản ánh được cơ chế kinh tế thực.</w:t>
       </w:r>
     </w:p>
     <w:p>
@@ -20736,7 +21353,7 @@
           <w:bCs/>
           <w:b/>
         </w:rPr>
-        <w:t xml:space="preserve">(2) Hệ thống phòng thủ ba tầng cho panel đa thế hệ là đóng góp phương pháp luận</w:t>
+        <w:t xml:space="preserve">(2) Hệ thống phòng thủ ba tầng cho dữ liệu bảng đa thế hệ là đóng góp phương pháp luận</w:t>
       </w:r>
       <w:r>
         <w:t xml:space="preserve">: Ba tầng kiểm chứng, biến giả Post_BREADY_2024, kiểm định ổn định mô hình neo, panel hậu đại dịch độc lập, là giao thức có thể chuẩn hóa cho bất kỳ nghiên cứu dùng WBES với nhiều thế hệ lược đồ.</w:t>
@@ -20751,10 +21368,10 @@
           <w:bCs/>
           <w:b/>
         </w:rPr>
-        <w:t xml:space="preserve">(3) Winsorize trong cụm quốc gia × năm tốt hơn winsorize tổng thể</w:t>
-      </w:r>
-      <w:r>
-        <w:t xml:space="preserve">: Winsorize tổng thể bóp méo phân phối tại các nhóm phân tán rộng (Nhóm V: P90/P10 ~30 lần trong đợt). Winsorize trong cụm bảo tồn dị biệt cross-regime quan trọng về lý thuyết.</w:t>
+        <w:t xml:space="preserve">(3) Winsorize trong cụm quốc gia × năm tốt hơn cắt đuôi tổng thể</w:t>
+      </w:r>
+      <w:r>
+        <w:t xml:space="preserve">: Cắt đuôi tổng thể bóp méo phân phối tại các nhóm phân tán rộng (Nhóm V: P90/P10 ~30 lần trong đợt). Winsorize trong cụm bảo tồn dị biệt cross-regime quan trọng về lý thuyết.</w:t>
       </w:r>
     </w:p>
     <w:p>
@@ -20865,7 +21482,7 @@
         <w:t xml:space="preserve">KL3, Nghịch lý bão hòa số là cơ chế đo lường, không phải thất bại thị trường</w:t>
       </w:r>
       <w:r>
-        <w:t xml:space="preserve">: Phần bù DAI thấp nhất tại Advanced là hệ quả của đo lường Tầng 1 trong bối cảnh Tầng 2/3 đã được áp dụng rộng.</w:t>
+        <w:t xml:space="preserve">: Phần bù DAI thấp nhất tại Advanced là hệ quả của đo lường Bậc 1 trong bối cảnh Bậc 2/3 đã được áp dụng rộng.</w:t>
       </w:r>
     </w:p>
     <w:p>
@@ -21004,10 +21621,10 @@
           <w:bCs/>
           <w:b/>
         </w:rPr>
-        <w:t xml:space="preserve">(2) Ưu tiên Tier-2 số cho SME Việt Nam</w:t>
-      </w:r>
-      <w:r>
-        <w:t xml:space="preserve">: Website 47% là điểm đầu vào; VietQR, TikTok Shop, Shopee Asia Pacific là Tầng 1.5/Tầng 2 thực tế hơn. Voucher AI Adoption (~50 triệu VND/doanh nghiệp) giúp vượt qua giai đoạn đầu tư ban đầu.</w:t>
+        <w:t xml:space="preserve">(2) Ưu tiên Bậc 2 số cho SME Việt Nam</w:t>
+      </w:r>
+      <w:r>
+        <w:t xml:space="preserve">: Website 47% là điểm đầu vào; VietQR, TikTok Shop, Shopee Asia Pacific là Bậc 1.5/Bậc 2 thực tế hơn. Voucher AI Adoption (~50 triệu VND/doanh nghiệp) giúp vượt qua giai đoạn đầu tư ban đầu.</w:t>
       </w:r>
     </w:p>
     <w:p>
@@ -21067,7 +21684,7 @@
         <w:t xml:space="preserve">(6) Chính sách số hóa phân cấp theo vùng và quy mô</w:t>
       </w:r>
       <w:r>
-        <w:t xml:space="preserve">: Hiệu ứng DAI phụ thuộc bối cảnh, đầu tư website khác nhau tại TP.HCM (Tier-1.5) so với nông thôn đồng bằng sông Cửu Long (Tier-1 chưa bão hòa).</w:t>
+        <w:t xml:space="preserve">: Hiệu ứng DAI phụ thuộc bối cảnh, đầu tư website khác nhau tại TP.HCM (Bậc 1.5) so với nông thôn đồng bằng sông Cửu Long (Bậc 1 chưa bão hòa).</w:t>
       </w:r>
     </w:p>
     <w:p>
@@ -21179,13 +21796,13 @@
         <w:t xml:space="preserve"> </w:t>
       </w:r>
       <w:r>
-        <w:t xml:space="preserve">(a) Singapore/Hàn Quốc AI full-stack (Tier-3), không phù hợp để sao chép trực tiếp;</w:t>
-      </w:r>
-      <w:r>
-        <w:t xml:space="preserve"> </w:t>
-      </w:r>
-      <w:r>
-        <w:t xml:space="preserve">(b) Nhật Bản 60% doanh nghiệp AI back-office (Tier-2),</w:t>
+        <w:t xml:space="preserve">(a) Singapore/Hàn Quốc AI full-stack (Bậc 3), không phù hợp để sao chép trực tiếp;</w:t>
+      </w:r>
+      <w:r>
+        <w:t xml:space="preserve"> </w:t>
+      </w:r>
+      <w:r>
+        <w:t xml:space="preserve">(b) Nhật Bản 60% doanh nghiệp AI back-office (Bậc 2),</w:t>
       </w:r>
       <w:r>
         <w:t xml:space="preserve"> </w:t>
@@ -21204,7 +21821,7 @@
         <w:t xml:space="preserve"> </w:t>
       </w:r>
       <w:r>
-        <w:t xml:space="preserve">(c) Trung Quốc sản xuất thông minh (Tier-2/3), học điểm tích cực, tránh rủi ro tập trung;</w:t>
+        <w:t xml:space="preserve">(c) Trung Quốc sản xuất thông minh (Bậc 2/3), học điểm tích cực, tránh rủi ro tập trung;</w:t>
       </w:r>
       <w:r>
         <w:t xml:space="preserve"> </w:t>
@@ -21220,7 +21837,7 @@
           <w:bCs/>
           <w:b/>
         </w:rPr>
-        <w:t xml:space="preserve">Mô hình ưu tiên Việt Nam Tier-1.5</w:t>
+        <w:t xml:space="preserve">Mô hình ưu tiên Việt Nam Bậc 1.5</w:t>
       </w:r>
       <w:r>
         <w:t xml:space="preserve">: VietQR (100% miễn phí) sang Thương mại xã hội sang Xuyên biên giới Shopee/Amazon sang Cloud và AI cơ bản.</w:t>
@@ -21271,7 +21888,7 @@
         <w:t xml:space="preserve">(2) Lọc mẫu</w:t>
       </w:r>
       <w:r>
-        <w:t xml:space="preserve">: Loại micro firms (&lt; 5 lao động) và doanh nghiệp nhà nước. Kết quả cần bền vững trong SME tư nhân (n ≈ 80.000+).</w:t>
+        <w:t xml:space="preserve">: Loại doanh nghiệp siêu nhỏ (micro firms, &lt; 5 lao động) và doanh nghiệp nhà nước. Kết quả cần bền vững trong SME tư nhân (n ≈ 80.000+).</w:t>
       </w:r>
     </w:p>
     <w:p>
@@ -21613,7 +22230,7 @@
         <w:pStyle w:val="BodyText"/>
       </w:pPr>
       <w:r>
-        <w:t xml:space="preserve">Briguglio, L. (1995). Small island developing states and their economic vulnerabilities.</w:t>
+        <w:t xml:space="preserve">Beugelsdijk, S., Kostova, T., Kunst, V. E., Spadafora, E., &amp; van Essen, M. (2018). Cultural distance and firm internationalization: A meta-analytical review and theoretical implications.</w:t>
       </w:r>
       <w:r>
         <w:t xml:space="preserve"> </w:t>
@@ -21623,10 +22240,10 @@
           <w:iCs/>
           <w:i/>
         </w:rPr>
-        <w:t xml:space="preserve">World Development, 23</w:t>
-      </w:r>
-      <w:r>
-        <w:t xml:space="preserve">(9), 1615–1632.</w:t>
+        <w:t xml:space="preserve">Journal of Management, 44</w:t>
+      </w:r>
+      <w:r>
+        <w:t xml:space="preserve">(1), 89–130. https://doi.org/10.1177/0149206317729027</w:t>
       </w:r>
     </w:p>
     <w:p>
@@ -21634,7 +22251,7 @@
         <w:pStyle w:val="BodyText"/>
       </w:pPr>
       <w:r>
-        <w:t xml:space="preserve">Brynjolfsson, E., &amp; McAfee, A. (2014).</w:t>
+        <w:t xml:space="preserve">Briguglio, L. (1995). Small island developing states and their economic vulnerabilities.</w:t>
       </w:r>
       <w:r>
         <w:t xml:space="preserve"> </w:t>
@@ -21644,10 +22261,10 @@
           <w:iCs/>
           <w:i/>
         </w:rPr>
-        <w:t xml:space="preserve">The second machine age: Work, progress, and prosperity in a time of brilliant technologies</w:t>
-      </w:r>
-      <w:r>
-        <w:t xml:space="preserve">. W. W. Norton &amp; Company.</w:t>
+        <w:t xml:space="preserve">World Development, 23</w:t>
+      </w:r>
+      <w:r>
+        <w:t xml:space="preserve">(9), 1615–1632.</w:t>
       </w:r>
     </w:p>
     <w:p>
@@ -21655,7 +22272,7 @@
         <w:pStyle w:val="BodyText"/>
       </w:pPr>
       <w:r>
-        <w:t xml:space="preserve">Cohen, W. M., &amp; Levinthal, D. A. (1990). Absorptive capacity: A new perspective on learning and innovation.</w:t>
+        <w:t xml:space="preserve">Brynjolfsson, E., &amp; McAfee, A. (2014).</w:t>
       </w:r>
       <w:r>
         <w:t xml:space="preserve"> </w:t>
@@ -21665,10 +22282,10 @@
           <w:iCs/>
           <w:i/>
         </w:rPr>
-        <w:t xml:space="preserve">Administrative Science Quarterly, 35</w:t>
-      </w:r>
-      <w:r>
-        <w:t xml:space="preserve">(1), 128–152.</w:t>
+        <w:t xml:space="preserve">The second machine age: Work, progress, and prosperity in a time of brilliant technologies</w:t>
+      </w:r>
+      <w:r>
+        <w:t xml:space="preserve">. W. W. Norton &amp; Company.</w:t>
       </w:r>
     </w:p>
     <w:p>
@@ -21676,7 +22293,7 @@
         <w:pStyle w:val="BodyText"/>
       </w:pPr>
       <w:r>
-        <w:t xml:space="preserve">Coltman, T., Devinney, T. M., Midgley, D. F., &amp; Venaik, S. (2008). Formative versus reflective measurement models: Two applications of formative measurement.</w:t>
+        <w:t xml:space="preserve">Cohen, W. M., &amp; Levinthal, D. A. (1990). Absorptive capacity: A new perspective on learning and innovation.</w:t>
       </w:r>
       <w:r>
         <w:t xml:space="preserve"> </w:t>
@@ -21686,10 +22303,10 @@
           <w:iCs/>
           <w:i/>
         </w:rPr>
-        <w:t xml:space="preserve">Journal of Business Research, 61</w:t>
-      </w:r>
-      <w:r>
-        <w:t xml:space="preserve">(12), 1250–1262. https://doi.org/10.1016/j.jbusres.2008.01.013</w:t>
+        <w:t xml:space="preserve">Administrative Science Quarterly, 35</w:t>
+      </w:r>
+      <w:r>
+        <w:t xml:space="preserve">(1), 128–152.</w:t>
       </w:r>
     </w:p>
     <w:p>
@@ -21697,7 +22314,7 @@
         <w:pStyle w:val="BodyText"/>
       </w:pPr>
       <w:r>
-        <w:t xml:space="preserve">Combs, J. G., Crook, T. R., &amp; Shook, C. L. (2005). The dimensionality of organizational performance and its implications for strategic management research. In D. J. Ketchen &amp; D. D. Bergh (Eds.),</w:t>
+        <w:t xml:space="preserve">Coltman, T., Devinney, T. M., Midgley, D. F., &amp; Venaik, S. (2008). Formative versus reflective measurement models: Two applications of formative measurement.</w:t>
       </w:r>
       <w:r>
         <w:t xml:space="preserve"> </w:t>
@@ -21707,13 +22324,10 @@
           <w:iCs/>
           <w:i/>
         </w:rPr>
-        <w:t xml:space="preserve">Research methodology in strategy and management</w:t>
-      </w:r>
-      <w:r>
-        <w:t xml:space="preserve"> </w:t>
-      </w:r>
-      <w:r>
-        <w:t xml:space="preserve">(Vol. 2, pp. 259–286). Emerald. https://doi.org/10.1016/S1479-8387(05)02011-4</w:t>
+        <w:t xml:space="preserve">Journal of Business Research, 61</w:t>
+      </w:r>
+      <w:r>
+        <w:t xml:space="preserve">(12), 1250–1262. https://doi.org/10.1016/j.jbusres.2008.01.013</w:t>
       </w:r>
     </w:p>
     <w:p>
@@ -21721,7 +22335,7 @@
         <w:pStyle w:val="BodyText"/>
       </w:pPr>
       <w:r>
-        <w:t xml:space="preserve">Contractor, F. J., Kundu, S. K., &amp; Hsu, C. C. (2003). A three-stage theory of international expansion.</w:t>
+        <w:t xml:space="preserve">Combs, J. G., Crook, T. R., &amp; Shook, C. L. (2005). The dimensionality of organizational performance and its implications for strategic management research. In D. J. Ketchen &amp; D. D. Bergh (Eds.),</w:t>
       </w:r>
       <w:r>
         <w:t xml:space="preserve"> </w:t>
@@ -21731,10 +22345,13 @@
           <w:iCs/>
           <w:i/>
         </w:rPr>
-        <w:t xml:space="preserve">Journal of International Business Studies, 34</w:t>
-      </w:r>
-      <w:r>
-        <w:t xml:space="preserve">(1), 5–18.</w:t>
+        <w:t xml:space="preserve">Research methodology in strategy and management</w:t>
+      </w:r>
+      <w:r>
+        <w:t xml:space="preserve"> </w:t>
+      </w:r>
+      <w:r>
+        <w:t xml:space="preserve">(Vol. 2, pp. 259–286). Emerald. https://doi.org/10.1016/S1479-8387(05)02011-4</w:t>
       </w:r>
     </w:p>
     <w:p>
@@ -21742,7 +22359,7 @@
         <w:pStyle w:val="BodyText"/>
       </w:pPr>
       <w:r>
-        <w:t xml:space="preserve">Cusolito, A. P., &amp; Maloney, W. F. (2018).</w:t>
+        <w:t xml:space="preserve">Contractor, F. J., Kundu, S. K., &amp; Hsu, C. C. (2003). A three-stage theory of international expansion.</w:t>
       </w:r>
       <w:r>
         <w:t xml:space="preserve"> </w:t>
@@ -21752,10 +22369,10 @@
           <w:iCs/>
           <w:i/>
         </w:rPr>
-        <w:t xml:space="preserve">Productivity revisited: Shifting paradigms in analysis and policy</w:t>
-      </w:r>
-      <w:r>
-        <w:t xml:space="preserve">. World Bank Group.</w:t>
+        <w:t xml:space="preserve">Journal of International Business Studies, 34</w:t>
+      </w:r>
+      <w:r>
+        <w:t xml:space="preserve">(1), 5–18.</w:t>
       </w:r>
     </w:p>
     <w:p>
@@ -21763,7 +22380,7 @@
         <w:pStyle w:val="BodyText"/>
       </w:pPr>
       <w:r>
-        <w:t xml:space="preserve">David, P. A. (1990). The dynamo and the computer: An historical perspective on the modern productivity paradox.</w:t>
+        <w:t xml:space="preserve">Cusolito, A. P., &amp; Maloney, W. F. (2018).</w:t>
       </w:r>
       <w:r>
         <w:t xml:space="preserve"> </w:t>
@@ -21773,10 +22390,10 @@
           <w:iCs/>
           <w:i/>
         </w:rPr>
-        <w:t xml:space="preserve">American Economic Review, 80</w:t>
-      </w:r>
-      <w:r>
-        <w:t xml:space="preserve">(2), 355–361.</w:t>
+        <w:t xml:space="preserve">Productivity revisited: Shifting paradigms in analysis and policy</w:t>
+      </w:r>
+      <w:r>
+        <w:t xml:space="preserve">. World Bank Group.</w:t>
       </w:r>
     </w:p>
     <w:p>
@@ -21784,7 +22401,7 @@
         <w:pStyle w:val="BodyText"/>
       </w:pPr>
       <w:r>
-        <w:t xml:space="preserve">Đỗ, T. H., &amp; Phan, A. T. (2026). Internationalization and firm performance in Vietnam.</w:t>
+        <w:t xml:space="preserve">David, P. A. (1990). The dynamo and the computer: An historical perspective on the modern productivity paradox.</w:t>
       </w:r>
       <w:r>
         <w:t xml:space="preserve"> </w:t>
@@ -21794,13 +22411,10 @@
           <w:iCs/>
           <w:i/>
         </w:rPr>
-        <w:t xml:space="preserve">Journal of Asia Business Studies</w:t>
-      </w:r>
-      <w:r>
-        <w:t xml:space="preserve"> </w:t>
-      </w:r>
-      <w:r>
-        <w:t xml:space="preserve">(đang phản biện).</w:t>
+        <w:t xml:space="preserve">American Economic Review, 80</w:t>
+      </w:r>
+      <w:r>
+        <w:t xml:space="preserve">(2), 355–361.</w:t>
       </w:r>
     </w:p>
     <w:p>
@@ -21808,7 +22422,7 @@
         <w:pStyle w:val="BodyText"/>
       </w:pPr>
       <w:r>
-        <w:t xml:space="preserve">Hall, P. A., &amp; Soskice, D. (Eds.). (2001).</w:t>
+        <w:t xml:space="preserve">Đỗ, T. H., &amp; Phan, A. T. (2026). Internationalization and firm performance in Vietnam.</w:t>
       </w:r>
       <w:r>
         <w:t xml:space="preserve"> </w:t>
@@ -21818,10 +22432,13 @@
           <w:iCs/>
           <w:i/>
         </w:rPr>
-        <w:t xml:space="preserve">Varieties of capitalism: The institutional foundations of comparative advantage</w:t>
-      </w:r>
-      <w:r>
-        <w:t xml:space="preserve">. Oxford University Press.</w:t>
+        <w:t xml:space="preserve">Journal of Asia Business Studies</w:t>
+      </w:r>
+      <w:r>
+        <w:t xml:space="preserve"> </w:t>
+      </w:r>
+      <w:r>
+        <w:t xml:space="preserve">(đang phản biện).</w:t>
       </w:r>
     </w:p>
     <w:p>
@@ -21829,7 +22446,7 @@
         <w:pStyle w:val="BodyText"/>
       </w:pPr>
       <w:r>
-        <w:t xml:space="preserve">Hambrick, D. C., &amp; Mason, P. A. (1984). Upper echelons: The organization as a reflection of its top managers.</w:t>
+        <w:t xml:space="preserve">Hall, P. A., &amp; Soskice, D. (Eds.). (2001).</w:t>
       </w:r>
       <w:r>
         <w:t xml:space="preserve"> </w:t>
@@ -21839,10 +22456,10 @@
           <w:iCs/>
           <w:i/>
         </w:rPr>
-        <w:t xml:space="preserve">Academy of Management Review, 9</w:t>
-      </w:r>
-      <w:r>
-        <w:t xml:space="preserve">(2), 193–206. https://doi.org/10.5465/amr.1984.4277628</w:t>
+        <w:t xml:space="preserve">Varieties of capitalism: The institutional foundations of comparative advantage</w:t>
+      </w:r>
+      <w:r>
+        <w:t xml:space="preserve">. Oxford University Press.</w:t>
       </w:r>
     </w:p>
     <w:p>
@@ -21850,7 +22467,7 @@
         <w:pStyle w:val="BodyText"/>
       </w:pPr>
       <w:r>
-        <w:t xml:space="preserve">Hertog, S. (2010).</w:t>
+        <w:t xml:space="preserve">Hambrick, D. C., &amp; Mason, P. A. (1984). Upper echelons: The organization as a reflection of its top managers.</w:t>
       </w:r>
       <w:r>
         <w:t xml:space="preserve"> </w:t>
@@ -21860,10 +22477,10 @@
           <w:iCs/>
           <w:i/>
         </w:rPr>
-        <w:t xml:space="preserve">Princes, brokers, and bureaucrats: Oil and the state in Saudi Arabia</w:t>
-      </w:r>
-      <w:r>
-        <w:t xml:space="preserve">. Cornell University Press.</w:t>
+        <w:t xml:space="preserve">Academy of Management Review, 9</w:t>
+      </w:r>
+      <w:r>
+        <w:t xml:space="preserve">(2), 193–206. https://doi.org/10.5465/amr.1984.4277628</w:t>
       </w:r>
     </w:p>
     <w:p>
@@ -21871,7 +22488,7 @@
         <w:pStyle w:val="BodyText"/>
       </w:pPr>
       <w:r>
-        <w:t xml:space="preserve">Hessels, J., &amp; Terjesen, S. (2010). Resource dependency and institutional theory perspectives on direct and indirect export choices.</w:t>
+        <w:t xml:space="preserve">Hertog, S. (2010).</w:t>
       </w:r>
       <w:r>
         <w:t xml:space="preserve"> </w:t>
@@ -21881,10 +22498,10 @@
           <w:iCs/>
           <w:i/>
         </w:rPr>
-        <w:t xml:space="preserve">Small Business Economics, 34</w:t>
-      </w:r>
-      <w:r>
-        <w:t xml:space="preserve">(2), 203–220. https://doi.org/10.1007/s11187-008-9156-4</w:t>
+        <w:t xml:space="preserve">Princes, brokers, and bureaucrats: Oil and the state in Saudi Arabia</w:t>
+      </w:r>
+      <w:r>
+        <w:t xml:space="preserve">. Cornell University Press.</w:t>
       </w:r>
     </w:p>
     <w:p>
@@ -21892,7 +22509,7 @@
         <w:pStyle w:val="BodyText"/>
       </w:pPr>
       <w:r>
-        <w:t xml:space="preserve">Hsieh, C.-T., &amp; Klenow, P. J. (2009). Misallocation and manufacturing TFP in China and India.</w:t>
+        <w:t xml:space="preserve">Hessels, J., &amp; Terjesen, S. (2010). Resource dependency and institutional theory perspectives on direct and indirect export choices.</w:t>
       </w:r>
       <w:r>
         <w:t xml:space="preserve"> </w:t>
@@ -21902,10 +22519,10 @@
           <w:iCs/>
           <w:i/>
         </w:rPr>
-        <w:t xml:space="preserve">Quarterly Journal of Economics, 124</w:t>
-      </w:r>
-      <w:r>
-        <w:t xml:space="preserve">(4), 1403–1448.</w:t>
+        <w:t xml:space="preserve">Small Business Economics, 34</w:t>
+      </w:r>
+      <w:r>
+        <w:t xml:space="preserve">(2), 203–220. https://doi.org/10.1007/s11187-008-9156-4</w:t>
       </w:r>
     </w:p>
     <w:p>
@@ -21913,7 +22530,7 @@
         <w:pStyle w:val="BodyText"/>
       </w:pPr>
       <w:r>
-        <w:t xml:space="preserve">Hsieh, C.-T., &amp; Klenow, P. J. (2014). The life cycle of plants in India and Mexico.</w:t>
+        <w:t xml:space="preserve">Hsieh, C.-T., &amp; Klenow, P. J. (2009). Misallocation and manufacturing TFP in China and India.</w:t>
       </w:r>
       <w:r>
         <w:t xml:space="preserve"> </w:t>
@@ -21923,10 +22540,10 @@
           <w:iCs/>
           <w:i/>
         </w:rPr>
-        <w:t xml:space="preserve">Quarterly Journal of Economics, 129</w:t>
-      </w:r>
-      <w:r>
-        <w:t xml:space="preserve">(3), 1035–1084.</w:t>
+        <w:t xml:space="preserve">Quarterly Journal of Economics, 124</w:t>
+      </w:r>
+      <w:r>
+        <w:t xml:space="preserve">(4), 1403–1448.</w:t>
       </w:r>
     </w:p>
     <w:p>
@@ -21934,7 +22551,7 @@
         <w:pStyle w:val="BodyText"/>
       </w:pPr>
       <w:r>
-        <w:t xml:space="preserve">Johanson, J., &amp; Vahlne, J.-E. (1977). The internationalization process of the firm.</w:t>
+        <w:t xml:space="preserve">Hsieh, C.-T., &amp; Klenow, P. J. (2014). The life cycle of plants in India and Mexico.</w:t>
       </w:r>
       <w:r>
         <w:t xml:space="preserve"> </w:t>
@@ -21944,10 +22561,10 @@
           <w:iCs/>
           <w:i/>
         </w:rPr>
-        <w:t xml:space="preserve">Journal of International Business Studies, 8</w:t>
-      </w:r>
-      <w:r>
-        <w:t xml:space="preserve">(1), 23–32.</w:t>
+        <w:t xml:space="preserve">Quarterly Journal of Economics, 129</w:t>
+      </w:r>
+      <w:r>
+        <w:t xml:space="preserve">(3), 1035–1084.</w:t>
       </w:r>
     </w:p>
     <w:p>
@@ -21955,7 +22572,7 @@
         <w:pStyle w:val="BodyText"/>
       </w:pPr>
       <w:r>
-        <w:t xml:space="preserve">Johanson, J., &amp; Vahlne, J.-E. (2009). The Uppsala internationalization process model revisited.</w:t>
+        <w:t xml:space="preserve">Johanson, J., &amp; Vahlne, J.-E. (1977). The internationalization process of the firm.</w:t>
       </w:r>
       <w:r>
         <w:t xml:space="preserve"> </w:t>
@@ -21965,10 +22582,10 @@
           <w:iCs/>
           <w:i/>
         </w:rPr>
-        <w:t xml:space="preserve">Journal of International Business Studies, 40</w:t>
-      </w:r>
-      <w:r>
-        <w:t xml:space="preserve">(9), 1411–1431.</w:t>
+        <w:t xml:space="preserve">Journal of International Business Studies, 8</w:t>
+      </w:r>
+      <w:r>
+        <w:t xml:space="preserve">(1), 23–32.</w:t>
       </w:r>
     </w:p>
     <w:p>
@@ -21976,7 +22593,7 @@
         <w:pStyle w:val="BodyText"/>
       </w:pPr>
       <w:r>
-        <w:t xml:space="preserve">Kafouros, M., Wang, C., Piperopoulos, P., &amp; Zhang, M. (2023). Academic publishing in business and management.</w:t>
+        <w:t xml:space="preserve">Johanson, J., &amp; Vahlne, J.-E. (2009). The Uppsala internationalization process model revisited.</w:t>
       </w:r>
       <w:r>
         <w:t xml:space="preserve"> </w:t>
@@ -21986,10 +22603,10 @@
           <w:iCs/>
           <w:i/>
         </w:rPr>
-        <w:t xml:space="preserve">Global Strategy Journal, 13</w:t>
-      </w:r>
-      <w:r>
-        <w:t xml:space="preserve">(1), 3–28.</w:t>
+        <w:t xml:space="preserve">Journal of International Business Studies, 40</w:t>
+      </w:r>
+      <w:r>
+        <w:t xml:space="preserve">(9), 1411–1431.</w:t>
       </w:r>
     </w:p>
     <w:p>
@@ -21997,7 +22614,7 @@
         <w:pStyle w:val="BodyText"/>
       </w:pPr>
       <w:r>
-        <w:t xml:space="preserve">Kaufmann, D., Kraay, A., &amp; Mastruzzi, M. (2011). The worldwide governance indicators: Methodology and analytical issues.</w:t>
+        <w:t xml:space="preserve">Kafouros, M., Wang, C., Piperopoulos, P., &amp; Zhang, M. (2023). Academic publishing in business and management.</w:t>
       </w:r>
       <w:r>
         <w:t xml:space="preserve"> </w:t>
@@ -22007,10 +22624,10 @@
           <w:iCs/>
           <w:i/>
         </w:rPr>
-        <w:t xml:space="preserve">Hague Journal on the Rule of Law, 3</w:t>
-      </w:r>
-      <w:r>
-        <w:t xml:space="preserve">(2), 220–246.</w:t>
+        <w:t xml:space="preserve">Global Strategy Journal, 13</w:t>
+      </w:r>
+      <w:r>
+        <w:t xml:space="preserve">(1), 3–28.</w:t>
       </w:r>
     </w:p>
     <w:p>
@@ -22018,7 +22635,7 @@
         <w:pStyle w:val="BodyText"/>
       </w:pPr>
       <w:r>
-        <w:t xml:space="preserve">Khanna, T., &amp; Palepu, K. G. (2010).</w:t>
+        <w:t xml:space="preserve">Kaufmann, D., Kraay, A., &amp; Mastruzzi, M. (2011). The worldwide governance indicators: Methodology and analytical issues.</w:t>
       </w:r>
       <w:r>
         <w:t xml:space="preserve"> </w:t>
@@ -22028,10 +22645,10 @@
           <w:iCs/>
           <w:i/>
         </w:rPr>
-        <w:t xml:space="preserve">Winning in emerging markets: A road map for strategy and execution</w:t>
-      </w:r>
-      <w:r>
-        <w:t xml:space="preserve">. Harvard Business Press.</w:t>
+        <w:t xml:space="preserve">Hague Journal on the Rule of Law, 3</w:t>
+      </w:r>
+      <w:r>
+        <w:t xml:space="preserve">(2), 220–246.</w:t>
       </w:r>
     </w:p>
     <w:p>
@@ -22039,7 +22656,7 @@
         <w:pStyle w:val="BodyText"/>
       </w:pPr>
       <w:r>
-        <w:t xml:space="preserve">Kirca, A. H., Roth, K., Hult, G. T. M., &amp; Cavusgil, S. T. (2012). The role of context in the multinationality-performance relationship: A meta-analytic review.</w:t>
+        <w:t xml:space="preserve">Khanna, T., &amp; Palepu, K. G. (2010).</w:t>
       </w:r>
       <w:r>
         <w:t xml:space="preserve"> </w:t>
@@ -22049,10 +22666,10 @@
           <w:iCs/>
           <w:i/>
         </w:rPr>
-        <w:t xml:space="preserve">Global Strategy Journal, 2</w:t>
-      </w:r>
-      <w:r>
-        <w:t xml:space="preserve">(2), 108–121.</w:t>
+        <w:t xml:space="preserve">Winning in emerging markets: A road map for strategy and execution</w:t>
+      </w:r>
+      <w:r>
+        <w:t xml:space="preserve">. Harvard Business Press.</w:t>
       </w:r>
     </w:p>
     <w:p>
@@ -22060,7 +22677,7 @@
         <w:pStyle w:val="BodyText"/>
       </w:pPr>
       <w:r>
-        <w:t xml:space="preserve">La Porta, R., &amp; Shleifer, A. (2008). The unofficial economy and economic development.</w:t>
+        <w:t xml:space="preserve">Kirca, A. H., Roth, K., Hult, G. T. M., &amp; Cavusgil, S. T. (2012). The role of context in the multinationality-performance relationship: A meta-analytic review.</w:t>
       </w:r>
       <w:r>
         <w:t xml:space="preserve"> </w:t>
@@ -22070,10 +22687,10 @@
           <w:iCs/>
           <w:i/>
         </w:rPr>
-        <w:t xml:space="preserve">Brookings Papers on Economic Activity, 2008</w:t>
-      </w:r>
-      <w:r>
-        <w:t xml:space="preserve">(2), 275–352.</w:t>
+        <w:t xml:space="preserve">Global Strategy Journal, 2</w:t>
+      </w:r>
+      <w:r>
+        <w:t xml:space="preserve">(2), 108–121.</w:t>
       </w:r>
     </w:p>
     <w:p>
@@ -22081,7 +22698,7 @@
         <w:pStyle w:val="BodyText"/>
       </w:pPr>
       <w:r>
-        <w:t xml:space="preserve">La Porta, R., &amp; Shleifer, A. (2014). Informality and development.</w:t>
+        <w:t xml:space="preserve">La Porta, R., &amp; Shleifer, A. (2008). The unofficial economy and economic development.</w:t>
       </w:r>
       <w:r>
         <w:t xml:space="preserve"> </w:t>
@@ -22091,10 +22708,10 @@
           <w:iCs/>
           <w:i/>
         </w:rPr>
-        <w:t xml:space="preserve">Journal of Economic Perspectives, 28</w:t>
-      </w:r>
-      <w:r>
-        <w:t xml:space="preserve">(3), 109–126. https://doi.org/10.1257/jep.28.3.109</w:t>
+        <w:t xml:space="preserve">Brookings Papers on Economic Activity, 2008</w:t>
+      </w:r>
+      <w:r>
+        <w:t xml:space="preserve">(2), 275–352.</w:t>
       </w:r>
     </w:p>
     <w:p>
@@ -22102,7 +22719,7 @@
         <w:pStyle w:val="BodyText"/>
       </w:pPr>
       <w:r>
-        <w:t xml:space="preserve">Lall, S. (1992). Technological capabilities and industrialization.</w:t>
+        <w:t xml:space="preserve">La Porta, R., &amp; Shleifer, A. (2014). Informality and development.</w:t>
       </w:r>
       <w:r>
         <w:t xml:space="preserve"> </w:t>
@@ -22112,10 +22729,10 @@
           <w:iCs/>
           <w:i/>
         </w:rPr>
-        <w:t xml:space="preserve">World Development, 20</w:t>
-      </w:r>
-      <w:r>
-        <w:t xml:space="preserve">(2), 165–186. https://doi.org/10.1016/0305-750X(92)90097-F</w:t>
+        <w:t xml:space="preserve">Journal of Economic Perspectives, 28</w:t>
+      </w:r>
+      <w:r>
+        <w:t xml:space="preserve">(3), 109–126. https://doi.org/10.1257/jep.28.3.109</w:t>
       </w:r>
     </w:p>
     <w:p>
@@ -22123,7 +22740,7 @@
         <w:pStyle w:val="BodyText"/>
       </w:pPr>
       <w:r>
-        <w:t xml:space="preserve">Lu, J. W., &amp; Beamish, P. W. (2001). The internationalization and performance of SMEs.</w:t>
+        <w:t xml:space="preserve">Lall, S. (1992). Technological capabilities and industrialization.</w:t>
       </w:r>
       <w:r>
         <w:t xml:space="preserve"> </w:t>
@@ -22133,10 +22750,10 @@
           <w:iCs/>
           <w:i/>
         </w:rPr>
-        <w:t xml:space="preserve">Strategic Management Journal, 22</w:t>
-      </w:r>
-      <w:r>
-        <w:t xml:space="preserve">(6–7), 565–586. https://doi.org/10.1002/smj.184</w:t>
+        <w:t xml:space="preserve">World Development, 20</w:t>
+      </w:r>
+      <w:r>
+        <w:t xml:space="preserve">(2), 165–186. https://doi.org/10.1016/0305-750X(92)90097-F</w:t>
       </w:r>
     </w:p>
     <w:p>
@@ -22144,7 +22761,7 @@
         <w:pStyle w:val="BodyText"/>
       </w:pPr>
       <w:r>
-        <w:t xml:space="preserve">Lu, J. W., &amp; Beamish, P. W. (2004). International diversification and firm performance: The S-curve hypothesis.</w:t>
+        <w:t xml:space="preserve">Lu, J. W., &amp; Beamish, P. W. (2001). The internationalization and performance of SMEs.</w:t>
       </w:r>
       <w:r>
         <w:t xml:space="preserve"> </w:t>
@@ -22154,10 +22771,10 @@
           <w:iCs/>
           <w:i/>
         </w:rPr>
-        <w:t xml:space="preserve">Academy of Management Journal, 47</w:t>
-      </w:r>
-      <w:r>
-        <w:t xml:space="preserve">(4), 598–609.</w:t>
+        <w:t xml:space="preserve">Strategic Management Journal, 22</w:t>
+      </w:r>
+      <w:r>
+        <w:t xml:space="preserve">(6–7), 565–586. https://doi.org/10.1002/smj.184</w:t>
       </w:r>
     </w:p>
     <w:p>
@@ -22165,7 +22782,7 @@
         <w:pStyle w:val="BodyText"/>
       </w:pPr>
       <w:r>
-        <w:t xml:space="preserve">Mar, T. T., Đỗ, T. H., &amp; Phan, A. T. (2026). Digital adoption and internationalization in Singapore.</w:t>
+        <w:t xml:space="preserve">Lu, J. W., &amp; Beamish, P. W. (2004). International diversification and firm performance: The S-curve hypothesis.</w:t>
       </w:r>
       <w:r>
         <w:t xml:space="preserve"> </w:t>
@@ -22175,13 +22792,10 @@
           <w:iCs/>
           <w:i/>
         </w:rPr>
-        <w:t xml:space="preserve">Management International Review</w:t>
-      </w:r>
-      <w:r>
-        <w:t xml:space="preserve"> </w:t>
-      </w:r>
-      <w:r>
-        <w:t xml:space="preserve">(đang phản biện).</w:t>
+        <w:t xml:space="preserve">Academy of Management Journal, 47</w:t>
+      </w:r>
+      <w:r>
+        <w:t xml:space="preserve">(4), 598–609.</w:t>
       </w:r>
     </w:p>
     <w:p>
@@ -22189,7 +22803,7 @@
         <w:pStyle w:val="BodyText"/>
       </w:pPr>
       <w:r>
-        <w:t xml:space="preserve">Marano, V., Arregle, J.-L., Hitt, M. A., Spadafora, E., &amp; van Essen, M. (2016). Home country institutions and the internationalization-performance relationship.</w:t>
+        <w:t xml:space="preserve">Mar, T. T., Đỗ, T. H., &amp; Phan, A. T. (2026). Digital adoption and internationalization in Singapore.</w:t>
       </w:r>
       <w:r>
         <w:t xml:space="preserve"> </w:t>
@@ -22199,10 +22813,13 @@
           <w:iCs/>
           <w:i/>
         </w:rPr>
-        <w:t xml:space="preserve">Journal of Management, 42</w:t>
-      </w:r>
-      <w:r>
-        <w:t xml:space="preserve">(5), 1075–1110.</w:t>
+        <w:t xml:space="preserve">Management International Review</w:t>
+      </w:r>
+      <w:r>
+        <w:t xml:space="preserve"> </w:t>
+      </w:r>
+      <w:r>
+        <w:t xml:space="preserve">(đang phản biện).</w:t>
       </w:r>
     </w:p>
     <w:p>
@@ -22210,7 +22827,7 @@
         <w:pStyle w:val="BodyText"/>
       </w:pPr>
       <w:r>
-        <w:t xml:space="preserve">North, D. C. (1990).</w:t>
+        <w:t xml:space="preserve">Marano, V., Arregle, J.-L., Hitt, M. A., Spadafora, E., &amp; van Essen, M. (2016). Home country institutions and the internationalization-performance relationship.</w:t>
       </w:r>
       <w:r>
         <w:t xml:space="preserve"> </w:t>
@@ -22220,10 +22837,10 @@
           <w:iCs/>
           <w:i/>
         </w:rPr>
-        <w:t xml:space="preserve">Institutions, institutional change and economic performance</w:t>
-      </w:r>
-      <w:r>
-        <w:t xml:space="preserve">. Cambridge University Press.</w:t>
+        <w:t xml:space="preserve">Journal of Management, 42</w:t>
+      </w:r>
+      <w:r>
+        <w:t xml:space="preserve">(5), 1075–1110.</w:t>
       </w:r>
     </w:p>
     <w:p>
@@ -22231,7 +22848,7 @@
         <w:pStyle w:val="BodyText"/>
       </w:pPr>
       <w:r>
-        <w:t xml:space="preserve">Paternoster, R., Brame, R., Mazerolle, P., &amp; Piquero, A. (1998). Using the correct statistical test for the equality of regression coefficients.</w:t>
+        <w:t xml:space="preserve">North, D. C. (1990).</w:t>
       </w:r>
       <w:r>
         <w:t xml:space="preserve"> </w:t>
@@ -22241,10 +22858,10 @@
           <w:iCs/>
           <w:i/>
         </w:rPr>
-        <w:t xml:space="preserve">Criminology, 36</w:t>
-      </w:r>
-      <w:r>
-        <w:t xml:space="preserve">(4), 859–866.</w:t>
+        <w:t xml:space="preserve">Institutions, institutional change and economic performance</w:t>
+      </w:r>
+      <w:r>
+        <w:t xml:space="preserve">. Cambridge University Press.</w:t>
       </w:r>
     </w:p>
     <w:p>
@@ -22252,7 +22869,7 @@
         <w:pStyle w:val="BodyText"/>
       </w:pPr>
       <w:r>
-        <w:t xml:space="preserve">Peng, M. W. (2001). The resource-based view and international business.</w:t>
+        <w:t xml:space="preserve">Paternoster, R., Brame, R., Mazerolle, P., &amp; Piquero, A. (1998). Using the correct statistical test for the equality of regression coefficients.</w:t>
       </w:r>
       <w:r>
         <w:t xml:space="preserve"> </w:t>
@@ -22262,10 +22879,10 @@
           <w:iCs/>
           <w:i/>
         </w:rPr>
-        <w:t xml:space="preserve">Journal of Management, 27</w:t>
-      </w:r>
-      <w:r>
-        <w:t xml:space="preserve">(6), 803–829.</w:t>
+        <w:t xml:space="preserve">Criminology, 36</w:t>
+      </w:r>
+      <w:r>
+        <w:t xml:space="preserve">(4), 859–866.</w:t>
       </w:r>
     </w:p>
     <w:p>
@@ -22273,7 +22890,7 @@
         <w:pStyle w:val="BodyText"/>
       </w:pPr>
       <w:r>
-        <w:t xml:space="preserve">Peng, M. W. (2003). Institutional transitions and strategic choices.</w:t>
+        <w:t xml:space="preserve">Peng, M. W. (2001). The resource-based view and international business.</w:t>
       </w:r>
       <w:r>
         <w:t xml:space="preserve"> </w:t>
@@ -22283,10 +22900,10 @@
           <w:iCs/>
           <w:i/>
         </w:rPr>
-        <w:t xml:space="preserve">Academy of Management Review, 28</w:t>
-      </w:r>
-      <w:r>
-        <w:t xml:space="preserve">(2), 275–296.</w:t>
+        <w:t xml:space="preserve">Journal of Management, 27</w:t>
+      </w:r>
+      <w:r>
+        <w:t xml:space="preserve">(6), 803–829.</w:t>
       </w:r>
     </w:p>
     <w:p>
@@ -22294,7 +22911,7 @@
         <w:pStyle w:val="BodyText"/>
       </w:pPr>
       <w:r>
-        <w:t xml:space="preserve">Peng, M. W., &amp; Ilinitch, A. Y. (1998). Export intermediary firms: A note on export development research.</w:t>
+        <w:t xml:space="preserve">Peng, M. W. (2003). Institutional transitions and strategic choices.</w:t>
       </w:r>
       <w:r>
         <w:t xml:space="preserve"> </w:t>
@@ -22304,10 +22921,10 @@
           <w:iCs/>
           <w:i/>
         </w:rPr>
-        <w:t xml:space="preserve">Journal of International Business Studies, 29</w:t>
-      </w:r>
-      <w:r>
-        <w:t xml:space="preserve">(3), 609–620. https://doi.org/10.1057/palgrave.jibs.8490011</w:t>
+        <w:t xml:space="preserve">Academy of Management Review, 28</w:t>
+      </w:r>
+      <w:r>
+        <w:t xml:space="preserve">(2), 275–296.</w:t>
       </w:r>
     </w:p>
     <w:p>
@@ -22315,7 +22932,7 @@
         <w:pStyle w:val="BodyText"/>
       </w:pPr>
       <w:r>
-        <w:t xml:space="preserve">Richard, P. J., Devinney, T. M., Yip, G. S., &amp; Johnson, G. (2009). Measuring organizational performance: Towards methodological best practice.</w:t>
+        <w:t xml:space="preserve">Peng, M. W., &amp; Ilinitch, A. Y. (1998). Export intermediary firms: A note on export development research.</w:t>
       </w:r>
       <w:r>
         <w:t xml:space="preserve"> </w:t>
@@ -22325,10 +22942,10 @@
           <w:iCs/>
           <w:i/>
         </w:rPr>
-        <w:t xml:space="preserve">Journal of Management, 35</w:t>
-      </w:r>
-      <w:r>
-        <w:t xml:space="preserve">(3), 718–804. https://doi.org/10.1177/0149206308330560</w:t>
+        <w:t xml:space="preserve">Journal of International Business Studies, 29</w:t>
+      </w:r>
+      <w:r>
+        <w:t xml:space="preserve">(3), 609–620. https://doi.org/10.1057/palgrave.jibs.8490011</w:t>
       </w:r>
     </w:p>
     <w:p>
@@ -22336,7 +22953,7 @@
         <w:pStyle w:val="BodyText"/>
       </w:pPr>
       <w:r>
-        <w:t xml:space="preserve">Sachs, J. D., &amp; Warner, A. M. (2001). The curse of natural resources.</w:t>
+        <w:t xml:space="preserve">Richard, P. J., Devinney, T. M., Yip, G. S., &amp; Johnson, G. (2009). Measuring organizational performance: Towards methodological best practice.</w:t>
       </w:r>
       <w:r>
         <w:t xml:space="preserve"> </w:t>
@@ -22346,10 +22963,10 @@
           <w:iCs/>
           <w:i/>
         </w:rPr>
-        <w:t xml:space="preserve">European Economic Review, 45</w:t>
-      </w:r>
-      <w:r>
-        <w:t xml:space="preserve">(4–6), 827–838.</w:t>
+        <w:t xml:space="preserve">Journal of Management, 35</w:t>
+      </w:r>
+      <w:r>
+        <w:t xml:space="preserve">(3), 718–804. https://doi.org/10.1177/0149206308330560</w:t>
       </w:r>
     </w:p>
     <w:p>
@@ -22357,7 +22974,7 @@
         <w:pStyle w:val="BodyText"/>
       </w:pPr>
       <w:r>
-        <w:t xml:space="preserve">Schwens, C., Zapkau, F. B., Brouthers, K. D., &amp; Hollender, L. (2018). How overconfidence can blind internationalization performance predictions.</w:t>
+        <w:t xml:space="preserve">Sachs, J. D., &amp; Warner, A. M. (2001). The curse of natural resources.</w:t>
       </w:r>
       <w:r>
         <w:t xml:space="preserve"> </w:t>
@@ -22367,10 +22984,10 @@
           <w:iCs/>
           <w:i/>
         </w:rPr>
-        <w:t xml:space="preserve">Journal of World Business, 53</w:t>
-      </w:r>
-      <w:r>
-        <w:t xml:space="preserve">(3), 290–301.</w:t>
+        <w:t xml:space="preserve">European Economic Review, 45</w:t>
+      </w:r>
+      <w:r>
+        <w:t xml:space="preserve">(4–6), 827–838.</w:t>
       </w:r>
     </w:p>
     <w:p>
@@ -22378,7 +22995,7 @@
         <w:pStyle w:val="BodyText"/>
       </w:pPr>
       <w:r>
-        <w:t xml:space="preserve">Scott, W. R. (1995).</w:t>
+        <w:t xml:space="preserve">Schwens, C., Zapkau, F. B., Brouthers, K. D., &amp; Hollender, L. (2018). How overconfidence can blind internationalization performance predictions.</w:t>
       </w:r>
       <w:r>
         <w:t xml:space="preserve"> </w:t>
@@ -22388,10 +23005,10 @@
           <w:iCs/>
           <w:i/>
         </w:rPr>
-        <w:t xml:space="preserve">Institutions and organizations</w:t>
-      </w:r>
-      <w:r>
-        <w:t xml:space="preserve">. Sage.</w:t>
+        <w:t xml:space="preserve">Journal of World Business, 53</w:t>
+      </w:r>
+      <w:r>
+        <w:t xml:space="preserve">(3), 290–301.</w:t>
       </w:r>
     </w:p>
     <w:p>
@@ -22399,7 +23016,7 @@
         <w:pStyle w:val="BodyText"/>
       </w:pPr>
       <w:r>
-        <w:t xml:space="preserve">Sikdar, A., &amp; Mukhopadhyay, A. (2026). Technology spillovers and firm performance in India.</w:t>
+        <w:t xml:space="preserve">Scott, W. R. (1995).</w:t>
       </w:r>
       <w:r>
         <w:t xml:space="preserve"> </w:t>
@@ -22409,10 +23026,10 @@
           <w:iCs/>
           <w:i/>
         </w:rPr>
-        <w:t xml:space="preserve">Asian Development Review, 43</w:t>
-      </w:r>
-      <w:r>
-        <w:t xml:space="preserve">(1), 37–75.</w:t>
+        <w:t xml:space="preserve">Institutions and organizations</w:t>
+      </w:r>
+      <w:r>
+        <w:t xml:space="preserve">. Sage.</w:t>
       </w:r>
     </w:p>
     <w:p>
@@ -22420,7 +23037,7 @@
         <w:pStyle w:val="BodyText"/>
       </w:pPr>
       <w:r>
-        <w:t xml:space="preserve">Stallkamp, M., &amp; Schotter, A. P. J. (2021). Platforms without borders?</w:t>
+        <w:t xml:space="preserve">Sikdar, A., &amp; Mukhopadhyay, A. (2026). Technology spillovers and firm performance in India.</w:t>
       </w:r>
       <w:r>
         <w:t xml:space="preserve"> </w:t>
@@ -22430,10 +23047,10 @@
           <w:iCs/>
           <w:i/>
         </w:rPr>
-        <w:t xml:space="preserve">Global Strategy Journal, 11</w:t>
-      </w:r>
-      <w:r>
-        <w:t xml:space="preserve">(1), 58–80.</w:t>
+        <w:t xml:space="preserve">Asian Development Review, 43</w:t>
+      </w:r>
+      <w:r>
+        <w:t xml:space="preserve">(1), 37–75.</w:t>
       </w:r>
     </w:p>
     <w:p>
@@ -22441,7 +23058,7 @@
         <w:pStyle w:val="BodyText"/>
       </w:pPr>
       <w:r>
-        <w:t xml:space="preserve">StartupBlink. (2026).</w:t>
+        <w:t xml:space="preserve">Stallkamp, M., &amp; Schotter, A. P. J. (2021). Platforms without borders?</w:t>
       </w:r>
       <w:r>
         <w:t xml:space="preserve"> </w:t>
@@ -22451,10 +23068,10 @@
           <w:iCs/>
           <w:i/>
         </w:rPr>
-        <w:t xml:space="preserve">Global startup ecosystem index 2026</w:t>
-      </w:r>
-      <w:r>
-        <w:t xml:space="preserve">. StartupBlink Research.</w:t>
+        <w:t xml:space="preserve">Global Strategy Journal, 11</w:t>
+      </w:r>
+      <w:r>
+        <w:t xml:space="preserve">(1), 58–80.</w:t>
       </w:r>
     </w:p>
     <w:p>
@@ -22462,7 +23079,7 @@
         <w:pStyle w:val="BodyText"/>
       </w:pPr>
       <w:r>
-        <w:t xml:space="preserve">Sullivan, D. (1994). Measuring the degree of internationalization of a firm.</w:t>
+        <w:t xml:space="preserve">StartupBlink. (2026).</w:t>
       </w:r>
       <w:r>
         <w:t xml:space="preserve"> </w:t>
@@ -22472,10 +23089,10 @@
           <w:iCs/>
           <w:i/>
         </w:rPr>
-        <w:t xml:space="preserve">Journal of International Business Studies, 25</w:t>
-      </w:r>
-      <w:r>
-        <w:t xml:space="preserve">(2), 325–342. https://doi.org/10.1057/palgrave.jibs.8490203</w:t>
+        <w:t xml:space="preserve">Global startup ecosystem index 2026</w:t>
+      </w:r>
+      <w:r>
+        <w:t xml:space="preserve">. StartupBlink Research.</w:t>
       </w:r>
     </w:p>
     <w:p>
@@ -22483,7 +23100,7 @@
         <w:pStyle w:val="BodyText"/>
       </w:pPr>
       <w:r>
-        <w:t xml:space="preserve">Teece, D. J., Pisano, G., &amp; Shuen, A. (1997). Dynamic capabilities and strategic management.</w:t>
+        <w:t xml:space="preserve">Sullivan, D. (1994). Measuring the degree of internationalization of a firm.</w:t>
       </w:r>
       <w:r>
         <w:t xml:space="preserve"> </w:t>
@@ -22493,10 +23110,10 @@
           <w:iCs/>
           <w:i/>
         </w:rPr>
-        <w:t xml:space="preserve">Strategic Management Journal, 18</w:t>
-      </w:r>
-      <w:r>
-        <w:t xml:space="preserve">(7), 509–533.</w:t>
+        <w:t xml:space="preserve">Journal of International Business Studies, 25</w:t>
+      </w:r>
+      <w:r>
+        <w:t xml:space="preserve">(2), 325–342. https://doi.org/10.1057/palgrave.jibs.8490203</w:t>
       </w:r>
     </w:p>
     <w:p>
@@ -22504,7 +23121,7 @@
         <w:pStyle w:val="BodyText"/>
       </w:pPr>
       <w:r>
-        <w:t xml:space="preserve">UNCTAD. (2023).</w:t>
+        <w:t xml:space="preserve">Teece, D. J., Pisano, G., &amp; Shuen, A. (1997). Dynamic capabilities and strategic management.</w:t>
       </w:r>
       <w:r>
         <w:t xml:space="preserve"> </w:t>
@@ -22514,10 +23131,10 @@
           <w:iCs/>
           <w:i/>
         </w:rPr>
-        <w:t xml:space="preserve">World investment report 2023</w:t>
-      </w:r>
-      <w:r>
-        <w:t xml:space="preserve">. United Nations Conference on Trade and Development.</w:t>
+        <w:t xml:space="preserve">Strategic Management Journal, 18</w:t>
+      </w:r>
+      <w:r>
+        <w:t xml:space="preserve">(7), 509–533.</w:t>
       </w:r>
     </w:p>
     <w:p>
@@ -22525,7 +23142,7 @@
         <w:pStyle w:val="BodyText"/>
       </w:pPr>
       <w:r>
-        <w:t xml:space="preserve">Venkatraman, N., &amp; Ramanujam, V. (1986). Measurement of business performance in strategy research.</w:t>
+        <w:t xml:space="preserve">UNCTAD. (2023).</w:t>
       </w:r>
       <w:r>
         <w:t xml:space="preserve"> </w:t>
@@ -22535,10 +23152,10 @@
           <w:iCs/>
           <w:i/>
         </w:rPr>
-        <w:t xml:space="preserve">Academy of Management Review, 11</w:t>
-      </w:r>
-      <w:r>
-        <w:t xml:space="preserve">(4), 801–814.</w:t>
+        <w:t xml:space="preserve">World investment report 2023</w:t>
+      </w:r>
+      <w:r>
+        <w:t xml:space="preserve">. United Nations Conference on Trade and Development.</w:t>
       </w:r>
     </w:p>
     <w:p>
@@ -22546,7 +23163,7 @@
         <w:pStyle w:val="BodyText"/>
       </w:pPr>
       <w:r>
-        <w:t xml:space="preserve">Verhoef, P. C., Broekhuizen, T., Bart, Y., Bhattacharya, A., Dong, J. Q., Fabian, N., &amp; Haenlein, M. (2021). Digital transformation: A multidisciplinary reflection and research agenda.</w:t>
+        <w:t xml:space="preserve">Venkatraman, N., &amp; Ramanujam, V. (1986). Measurement of business performance in strategy research.</w:t>
       </w:r>
       <w:r>
         <w:t xml:space="preserve"> </w:t>
@@ -22556,10 +23173,10 @@
           <w:iCs/>
           <w:i/>
         </w:rPr>
-        <w:t xml:space="preserve">Journal of Business Research, 122</w:t>
-      </w:r>
-      <w:r>
-        <w:t xml:space="preserve">, 889–901.</w:t>
+        <w:t xml:space="preserve">Academy of Management Review, 11</w:t>
+      </w:r>
+      <w:r>
+        <w:t xml:space="preserve">(4), 801–814.</w:t>
       </w:r>
     </w:p>
     <w:p>
@@ -22567,7 +23184,7 @@
         <w:pStyle w:val="BodyText"/>
       </w:pPr>
       <w:r>
-        <w:t xml:space="preserve">Wang, J., Huang, Y., &amp; Hong, H. (2024). Technology concentration and bank risk: Evidence from Chinese commercial banks.</w:t>
+        <w:t xml:space="preserve">Verhoef, P. C., Broekhuizen, T., Bart, Y., Bhattacharya, A., Dong, J. Q., Fabian, N., &amp; Haenlein, M. (2021). Digital transformation: A multidisciplinary reflection and research agenda.</w:t>
       </w:r>
       <w:r>
         <w:t xml:space="preserve"> </w:t>
@@ -22577,10 +23194,10 @@
           <w:iCs/>
           <w:i/>
         </w:rPr>
-        <w:t xml:space="preserve">International Review of Financial Analysis, 91</w:t>
-      </w:r>
-      <w:r>
-        <w:t xml:space="preserve">, 102968.</w:t>
+        <w:t xml:space="preserve">Journal of Business Research, 122</w:t>
+      </w:r>
+      <w:r>
+        <w:t xml:space="preserve">, 889–901.</w:t>
       </w:r>
     </w:p>
     <w:p>
@@ -22588,7 +23205,7 @@
         <w:pStyle w:val="BodyText"/>
       </w:pPr>
       <w:r>
-        <w:t xml:space="preserve">Wernerfelt, B. (1984). A resource-based view of the firm.</w:t>
+        <w:t xml:space="preserve">Wang, J., Huang, Y., &amp; Hong, H. (2024). Technology concentration and bank risk: Evidence from Chinese commercial banks.</w:t>
       </w:r>
       <w:r>
         <w:t xml:space="preserve"> </w:t>
@@ -22598,10 +23215,10 @@
           <w:iCs/>
           <w:i/>
         </w:rPr>
-        <w:t xml:space="preserve">Strategic Management Journal, 5</w:t>
-      </w:r>
-      <w:r>
-        <w:t xml:space="preserve">(2), 171–180.</w:t>
+        <w:t xml:space="preserve">International Review of Financial Analysis, 91</w:t>
+      </w:r>
+      <w:r>
+        <w:t xml:space="preserve">, 102968.</w:t>
       </w:r>
     </w:p>
     <w:p>
@@ -22609,7 +23226,7 @@
         <w:pStyle w:val="BodyText"/>
       </w:pPr>
       <w:r>
-        <w:t xml:space="preserve">Williamson, O. E. (1985).</w:t>
+        <w:t xml:space="preserve">Wernerfelt, B. (1984). A resource-based view of the firm.</w:t>
       </w:r>
       <w:r>
         <w:t xml:space="preserve"> </w:t>
@@ -22619,10 +23236,10 @@
           <w:iCs/>
           <w:i/>
         </w:rPr>
-        <w:t xml:space="preserve">The economic institutions of capitalism</w:t>
-      </w:r>
-      <w:r>
-        <w:t xml:space="preserve">. Free Press.</w:t>
+        <w:t xml:space="preserve">Strategic Management Journal, 5</w:t>
+      </w:r>
+      <w:r>
+        <w:t xml:space="preserve">(2), 171–180.</w:t>
       </w:r>
     </w:p>
     <w:p>
@@ -22630,7 +23247,7 @@
         <w:pStyle w:val="BodyText"/>
       </w:pPr>
       <w:r>
-        <w:t xml:space="preserve">World Bank. (2023).</w:t>
+        <w:t xml:space="preserve">Williamson, O. E. (1985).</w:t>
       </w:r>
       <w:r>
         <w:t xml:space="preserve"> </w:t>
@@ -22640,10 +23257,10 @@
           <w:iCs/>
           <w:i/>
         </w:rPr>
-        <w:t xml:space="preserve">World Bank Enterprise Surveys 2023</w:t>
-      </w:r>
-      <w:r>
-        <w:t xml:space="preserve">. World Bank Group.</w:t>
+        <w:t xml:space="preserve">The economic institutions of capitalism</w:t>
+      </w:r>
+      <w:r>
+        <w:t xml:space="preserve">. Free Press.</w:t>
       </w:r>
     </w:p>
     <w:p>
@@ -22651,7 +23268,7 @@
         <w:pStyle w:val="BodyText"/>
       </w:pPr>
       <w:r>
-        <w:t xml:space="preserve">World Bank. (2024).</w:t>
+        <w:t xml:space="preserve">World Bank. (2023).</w:t>
       </w:r>
       <w:r>
         <w:t xml:space="preserve"> </w:t>
@@ -22661,7 +23278,7 @@
           <w:iCs/>
           <w:i/>
         </w:rPr>
-        <w:t xml:space="preserve">World development indicators 2024</w:t>
+        <w:t xml:space="preserve">World Bank Enterprise Surveys 2023</w:t>
       </w:r>
       <w:r>
         <w:t xml:space="preserve">. World Bank Group.</w:t>
@@ -22672,7 +23289,7 @@
         <w:pStyle w:val="BodyText"/>
       </w:pPr>
       <w:r>
-        <w:t xml:space="preserve">World Bank. (2025a).</w:t>
+        <w:t xml:space="preserve">World Bank. (2024).</w:t>
       </w:r>
       <w:r>
         <w:t xml:space="preserve"> </w:t>
@@ -22682,7 +23299,7 @@
           <w:iCs/>
           <w:i/>
         </w:rPr>
-        <w:t xml:space="preserve">Taking stock, September 2025: Viet Nam economic update, Nurturing Viet Nam’s high-tech talents</w:t>
+        <w:t xml:space="preserve">World development indicators 2024</w:t>
       </w:r>
       <w:r>
         <w:t xml:space="preserve">. World Bank Group.</w:t>
@@ -22693,7 +23310,7 @@
         <w:pStyle w:val="BodyText"/>
       </w:pPr>
       <w:r>
-        <w:t xml:space="preserve">World Bank. (2025b).</w:t>
+        <w:t xml:space="preserve">World Bank. (2025a).</w:t>
       </w:r>
       <w:r>
         <w:t xml:space="preserve"> </w:t>
@@ -22703,10 +23320,10 @@
           <w:iCs/>
           <w:i/>
         </w:rPr>
-        <w:t xml:space="preserve">World Bank country and lending groups: FY2026</w:t>
-      </w:r>
-      <w:r>
-        <w:t xml:space="preserve">. World Bank Group. https://datahelpdesk.worldbank.org/knowledgebase/articles/906519</w:t>
+        <w:t xml:space="preserve">Taking stock, September 2025: Viet Nam economic update, Nurturing Viet Nam’s high-tech talents</w:t>
+      </w:r>
+      <w:r>
+        <w:t xml:space="preserve">. World Bank Group.</w:t>
       </w:r>
     </w:p>
     <w:p>
@@ -22714,7 +23331,7 @@
         <w:pStyle w:val="BodyText"/>
       </w:pPr>
       <w:r>
-        <w:t xml:space="preserve">World Bank. (2025c).</w:t>
+        <w:t xml:space="preserve">World Bank. (2025b).</w:t>
       </w:r>
       <w:r>
         <w:t xml:space="preserve"> </w:t>
@@ -22724,10 +23341,10 @@
           <w:iCs/>
           <w:i/>
         </w:rPr>
-        <w:t xml:space="preserve">World Bank Enterprise Surveys 2025</w:t>
-      </w:r>
-      <w:r>
-        <w:t xml:space="preserve">. World Bank Group.</w:t>
+        <w:t xml:space="preserve">World Bank country and lending groups: FY2026</w:t>
+      </w:r>
+      <w:r>
+        <w:t xml:space="preserve">. World Bank Group. https://datahelpdesk.worldbank.org/knowledgebase/articles/906519</w:t>
       </w:r>
     </w:p>
     <w:p>
@@ -22735,7 +23352,7 @@
         <w:pStyle w:val="BodyText"/>
       </w:pPr>
       <w:r>
-        <w:t xml:space="preserve">World Bank. (2026).</w:t>
+        <w:t xml:space="preserve">World Bank. (2025c).</w:t>
       </w:r>
       <w:r>
         <w:t xml:space="preserve"> </w:t>
@@ -22745,13 +23362,10 @@
           <w:iCs/>
           <w:i/>
         </w:rPr>
-        <w:t xml:space="preserve">Viet Nam: Data360 economy snapshot</w:t>
-      </w:r>
-      <w:r>
-        <w:t xml:space="preserve"> </w:t>
-      </w:r>
-      <w:r>
-        <w:t xml:space="preserve">(April 2026). World Bank Group.</w:t>
+        <w:t xml:space="preserve">World Bank Enterprise Surveys 2025</w:t>
+      </w:r>
+      <w:r>
+        <w:t xml:space="preserve">. World Bank Group.</w:t>
       </w:r>
     </w:p>
     <w:p>
@@ -22759,7 +23373,7 @@
         <w:pStyle w:val="BodyText"/>
       </w:pPr>
       <w:r>
-        <w:t xml:space="preserve">Wu, J., Xu, L., &amp; Yang, Z. (2022). Multinationality and performance of emerging economy multinational enterprises: A twenty-year study.</w:t>
+        <w:t xml:space="preserve">World Bank. (2026).</w:t>
       </w:r>
       <w:r>
         <w:t xml:space="preserve"> </w:t>
@@ -22769,10 +23383,34 @@
           <w:iCs/>
           <w:i/>
         </w:rPr>
+        <w:t xml:space="preserve">Viet Nam: Data360 economy snapshot</w:t>
+      </w:r>
+      <w:r>
+        <w:t xml:space="preserve"> </w:t>
+      </w:r>
+      <w:r>
+        <w:t xml:space="preserve">(April 2026). World Bank Group.</w:t>
+      </w:r>
+    </w:p>
+    <w:p>
+      <w:pPr>
+        <w:pStyle w:val="BodyText"/>
+      </w:pPr>
+      <w:r>
+        <w:t xml:space="preserve">Wu, J., Wood, G., &amp; Khan, Z. (2022). Internationalization and firm performance: Evidence from a meta-analysis.</w:t>
+      </w:r>
+      <w:r>
+        <w:t xml:space="preserve"> </w:t>
+      </w:r>
+      <w:r>
+        <w:rPr>
+          <w:iCs/>
+          <w:i/>
+        </w:rPr>
         <w:t xml:space="preserve">International Business Review, 31</w:t>
       </w:r>
       <w:r>
-        <w:t xml:space="preserve">(5), 102003.</w:t>
+        <w:t xml:space="preserve">(2), 101920.</w:t>
       </w:r>
     </w:p>
     <w:p>
@@ -23313,7 +23951,7 @@
           <w:iCs/>
           <w:i/>
         </w:rPr>
-        <w:t xml:space="preserve">Ghi chú: mỗi cặp nền kinh tế × năm lấy đúng một cross-section chuẩn WBES; loại các điều tra phi chính thức, siêu nhỏ (Micro) và panel mở rộng; chỉ nhận đợt khảo sát từ 2006 trở đi (bộ câu hỏi so sánh được toàn cầu). Nhật Bản 2025 (n=2.168) là thành viên đầy đủ của Nhóm I trong mẫu gộp mô tả. Khung ước lượng đa quốc gia của luận án (P7: 88.869 doanh nghiệp / 50 nền, gồm Nhật Bản; mẫu gộp phân loại 96.415 / 52 nền) được chạy theo quy trình tại Phụ lục A; vòng tái ước lượng 50 nền gồm Nhật Bản đã hoàn tất nên mô tả và ước lượng nay dùng chung MỘT khung 50 nền (hồi quy M2 N=81.022; M5 N=79.080).</w:t>
+        <w:t xml:space="preserve">Ghi chú: mỗi cặp nền kinh tế × năm lấy đúng một lát cắt ngang chuẩn WBES; loại các điều tra phi chính thức, siêu nhỏ (Micro) và panel mở rộng; chỉ nhận đợt khảo sát từ 2006 trở đi (bộ câu hỏi so sánh được toàn cầu). Nhật Bản 2025 (n=2.168) là thành viên đầy đủ của Nhóm I trong mẫu gộp mô tả. Khung ước lượng đa quốc gia của luận án (P7: 88.869 doanh nghiệp / 50 nền, gồm Nhật Bản; mẫu gộp phân loại 96.415 / 52 nền) được chạy theo quy trình tại Phụ lục A; vòng tái ước lượng 50 nền gồm Nhật Bản đã hoàn tất nên mô tả và ước lượng nay dùng chung MỘT khung 50 nền (hồi quy M2 N=81.022; M5 N=79.080).</w:t>
       </w:r>
     </w:p>
     <w:p>
@@ -23467,7 +24105,7 @@
               <w:jc w:val="left"/>
             </w:pPr>
             <w:r>
-              <w:t xml:space="preserve">Chỉ Tier-1 (website nhị phân)</w:t>
+              <w:t xml:space="preserve">Chỉ Bậc 1 (website nhị phân)</w:t>
             </w:r>
           </w:p>
         </w:tc>
@@ -23529,7 +24167,7 @@
               <w:jc w:val="left"/>
             </w:pPr>
             <w:r>
-              <w:t xml:space="preserve">Chỉ Tier-1</w:t>
+              <w:t xml:space="preserve">Chỉ Bậc 1</w:t>
             </w:r>
           </w:p>
         </w:tc>
@@ -23591,7 +24229,7 @@
               <w:jc w:val="left"/>
             </w:pPr>
             <w:r>
-              <w:t xml:space="preserve">Tier-1 + Tier-2 (thanh toán điện tử k33/k38)</w:t>
+              <w:t xml:space="preserve">Bậc 1 + Bậc 2 (thanh toán điện tử k33/k38)</w:t>
             </w:r>
           </w:p>
         </w:tc>
@@ -23631,7 +24269,7 @@
           <w:iCs/>
           <w:i/>
         </w:rPr>
-        <w:t xml:space="preserve">Nghiên cứu sinh: Đỗ Thùy Hương, Trường Đại học Kỹ thuật Công nghệ Vĩnh Long (VLUTE)</w:t>
+        <w:t xml:space="preserve">Nghiên cứu sinh: Đỗ Thùy Hương, Trường Đại học Cần Thơ</w:t>
       </w:r>
       <w:r>
         <w:t xml:space="preserve"> </w:t>

</xml_diff>

<commit_message>
build(docx): dựng lại bản Word luận án + CĐ theo nội dung đã khử giọng AI
Sinh lại từ Markdown nguồn đã chỉnh văn phong (Tóm tắt + 5 chương) và Lời cảm
ơn hoàn chỉnh:
- dist/word/LUAN_AN_vi.docx (bìa + phần đầu + 5 chương + TLTK + Phụ lục A–D)
- dist/word/CHUYEN_DE_1_vi.docx, dist/word/CHUYEN_DE_2_vi.docx
- dist/luan_an_ctu/LUAN_AN_FULL_vi.docx

Lưu ý: bản PDF (xelatex, định dạng CTU QĐ 1799/SH) là bản chuẩn về phân trang
La Mã/Ả Rập; .docx dùng đánh số trang theo cơ chế của Word.

Co-Authored-By: Claude Opus 4.8 (1M context) <noreply@anthropic.com>
Claude-Session: https://claude.ai/code/session_01Xumaoraa2DLWLXsgJJ62oq
</commit_message>
<xml_diff>
--- a/dist/word/CHUYEN_DE_1_vi.docx
+++ b/dist/word/CHUYEN_DE_1_vi.docx
@@ -5398,7 +5398,7 @@
           <wp:inline>
             <wp:extent cx="5753100" cy="2924179"/>
             <wp:effectExtent b="0" l="0" r="0" t="0"/>
-            <wp:docPr descr="Hình 2.3.1.1. Khung phân tích mô tả CĐ1 — tương quan giữa bốn yếu tố và năng suất lao động theo bối cảnh thể chế ICRV (mẫu gộp mô tả 88.869 doanh nghiệp, 50 nền, 2006–2026)." title="" id="34" name="Picture"/>
+            <wp:docPr descr="Hình 2.3.1.1. Khung phân tích mô tả CĐ1: tương quan giữa bốn yếu tố và năng suất lao động theo bối cảnh thể chế ICRV (mẫu gộp mô tả 88.869 doanh nghiệp, 50 nền, 2006–2026)." title="" id="34" name="Picture"/>
             <a:graphic>
               <a:graphicData uri="http://schemas.openxmlformats.org/drawingml/2006/picture">
                 <pic:pic>
@@ -5441,7 +5441,7 @@
         <w:pStyle w:val="ImageCaption"/>
       </w:pPr>
       <w:r>
-        <w:t xml:space="preserve">Hình 2.3.1.1. Khung phân tích mô tả CĐ1 — tương quan giữa bốn yếu tố và năng suất lao động theo bối cảnh thể chế ICRV (mẫu gộp mô tả 88.869 doanh nghiệp, 50 nền, 2006–2026).</w:t>
+        <w:t xml:space="preserve">Hình 2.3.1.1. Khung phân tích mô tả CĐ1: tương quan giữa bốn yếu tố và năng suất lao động theo bối cảnh thể chế ICRV (mẫu gộp mô tả 88.869 doanh nghiệp, 50 nền, 2006–2026).</w:t>
       </w:r>
     </w:p>
     <w:p>
@@ -23503,7 +23503,7 @@
           <w:iCs/>
           <w:i/>
         </w:rPr>
-        <w:t xml:space="preserve">Phân bổ 50 nền kinh tế theo nhóm ICRV — khung mô tả LP-valid tái lập 84.998 doanh nghiệp, 107 cặp nền kinh tế × năm, 2006–2026 (cột n đã gồm China-2012 và đủ bốn đợt Azerbaijan).</w:t>
+        <w:t xml:space="preserve">Phân bổ 50 nền kinh tế theo nhóm ICRV: khung mô tả LP-valid tái lập 84.998 doanh nghiệp, 107 cặp nền kinh tế × năm, 2006–2026 (cột n đã gồm China-2012 và đủ bốn đợt Azerbaijan).</w:t>
       </w:r>
     </w:p>
     <w:tbl>

</xml_diff>